<commit_message>
done with aim logic
</commit_message>
<xml_diff>
--- a/问题StellarFront.docx
+++ b/问题StellarFront.docx
@@ -72,8 +72,6 @@
         </w:rPr>
         <w:t>first person动画的区别，看看有没有问题</w:t>
       </w:r>
-      <w:bookmarkStart w:id="0" w:name="_GoBack"/>
-      <w:bookmarkEnd w:id="0"/>
     </w:p>
     <w:p>
       <w:pPr>
@@ -98,6 +96,7 @@
       <w:pPr>
         <w:widowControl w:val="0"/>
         <w:numPr>
+          <w:ilvl w:val="0"/>
           <w:numId w:val="0"/>
         </w:numPr>
         <w:tabs>
@@ -142,17 +141,736 @@
         <w:ind w:left="0" w:leftChars="0" w:firstLine="0" w:firstLineChars="0"/>
         <w:jc w:val="both"/>
         <w:rPr>
+          <w:rFonts w:hint="eastAsia" w:asciiTheme="minorHAnsi" w:hAnsiTheme="minorHAnsi" w:eastAsiaTheme="minorEastAsia" w:cstheme="minorBidi"/>
+          <w:kern w:val="2"/>
+          <w:sz w:val="21"/>
+          <w:szCs w:val="24"/>
+          <w:lang w:val="en-US" w:eastAsia="zh-CN" w:bidi="ar-SA"/>
+        </w:rPr>
+      </w:pPr>
+      <w:r>
+        <w:rPr>
+          <w:rFonts w:hint="eastAsia" w:asciiTheme="minorHAnsi" w:hAnsiTheme="minorHAnsi" w:eastAsiaTheme="minorEastAsia" w:cstheme="minorBidi"/>
+          <w:kern w:val="2"/>
+          <w:sz w:val="21"/>
+          <w:szCs w:val="24"/>
+          <w:lang w:val="en-US" w:eastAsia="zh-CN" w:bidi="ar-SA"/>
+        </w:rPr>
+        <w:t>不是。ETriggerEvent::Triggered 不是固定“按一下触发一次”，它表示 Input Action 的触发条件正在满足。</w:t>
+      </w:r>
+    </w:p>
+    <w:p>
+      <w:pPr>
+        <w:widowControl w:val="0"/>
+        <w:numPr>
+          <w:ilvl w:val="0"/>
+          <w:numId w:val="1"/>
+        </w:numPr>
+        <w:ind w:left="0" w:leftChars="0" w:firstLine="420" w:firstLineChars="200"/>
+        <w:jc w:val="both"/>
+        <w:rPr>
+          <w:rFonts w:hint="eastAsia" w:asciiTheme="minorHAnsi" w:hAnsiTheme="minorHAnsi" w:eastAsiaTheme="minorEastAsia" w:cstheme="minorBidi"/>
+          <w:kern w:val="2"/>
+          <w:sz w:val="21"/>
+          <w:szCs w:val="24"/>
+          <w:lang w:val="en-US" w:eastAsia="zh-CN" w:bidi="ar-SA"/>
+        </w:rPr>
+      </w:pPr>
+      <w:r>
+        <w:rPr>
+          <w:rFonts w:hint="eastAsia" w:asciiTheme="minorHAnsi" w:hAnsiTheme="minorHAnsi" w:eastAsiaTheme="minorEastAsia" w:cstheme="minorBidi"/>
+          <w:kern w:val="2"/>
+          <w:sz w:val="21"/>
+          <w:szCs w:val="24"/>
+          <w:lang w:val="en-US" w:eastAsia="zh-CN" w:bidi="ar-SA"/>
+        </w:rPr>
+        <w:t>对普通按键来说：</w:t>
+      </w:r>
+    </w:p>
+    <w:p>
+      <w:pPr>
+        <w:widowControl w:val="0"/>
+        <w:numPr>
+          <w:ilvl w:val="0"/>
+          <w:numId w:val="1"/>
+        </w:numPr>
+        <w:ind w:left="0" w:leftChars="0" w:firstLine="420" w:firstLineChars="200"/>
+        <w:jc w:val="both"/>
+        <w:rPr>
+          <w:rFonts w:hint="eastAsia" w:asciiTheme="minorHAnsi" w:hAnsiTheme="minorHAnsi" w:eastAsiaTheme="minorEastAsia" w:cstheme="minorBidi"/>
+          <w:kern w:val="2"/>
+          <w:sz w:val="21"/>
+          <w:szCs w:val="24"/>
+          <w:lang w:val="en-US" w:eastAsia="zh-CN" w:bidi="ar-SA"/>
+        </w:rPr>
+      </w:pPr>
+      <w:r>
+        <w:rPr>
+          <w:rFonts w:hint="eastAsia" w:asciiTheme="minorHAnsi" w:hAnsiTheme="minorHAnsi" w:eastAsiaTheme="minorEastAsia" w:cstheme="minorBidi"/>
+          <w:kern w:val="2"/>
+          <w:sz w:val="21"/>
+          <w:szCs w:val="24"/>
+          <w:lang w:val="en-US" w:eastAsia="zh-CN" w:bidi="ar-SA"/>
+        </w:rPr>
+        <w:t>- 没加特殊 Trigger，或用 Down：Triggered 通常会在按住期间每帧触发</w:t>
+      </w:r>
+    </w:p>
+    <w:p>
+      <w:pPr>
+        <w:widowControl w:val="0"/>
+        <w:numPr>
+          <w:ilvl w:val="0"/>
+          <w:numId w:val="1"/>
+        </w:numPr>
+        <w:ind w:left="0" w:leftChars="0" w:firstLine="420" w:firstLineChars="200"/>
+        <w:jc w:val="both"/>
+        <w:rPr>
+          <w:rFonts w:hint="eastAsia" w:asciiTheme="minorHAnsi" w:hAnsiTheme="minorHAnsi" w:eastAsiaTheme="minorEastAsia" w:cstheme="minorBidi"/>
+          <w:kern w:val="2"/>
+          <w:sz w:val="21"/>
+          <w:szCs w:val="24"/>
+          <w:lang w:val="en-US" w:eastAsia="zh-CN" w:bidi="ar-SA"/>
+        </w:rPr>
+      </w:pPr>
+      <w:r>
+        <w:rPr>
+          <w:rFonts w:hint="eastAsia" w:asciiTheme="minorHAnsi" w:hAnsiTheme="minorHAnsi" w:eastAsiaTheme="minorEastAsia" w:cstheme="minorBidi"/>
+          <w:kern w:val="2"/>
+          <w:sz w:val="21"/>
+          <w:szCs w:val="24"/>
+          <w:lang w:val="en-US" w:eastAsia="zh-CN" w:bidi="ar-SA"/>
+        </w:rPr>
+        <w:t>- 用 Pressed Trigger：通常是按下瞬间触发一次</w:t>
+      </w:r>
+    </w:p>
+    <w:p>
+      <w:pPr>
+        <w:widowControl w:val="0"/>
+        <w:numPr>
+          <w:ilvl w:val="0"/>
+          <w:numId w:val="1"/>
+        </w:numPr>
+        <w:ind w:left="0" w:leftChars="0" w:firstLine="420" w:firstLineChars="200"/>
+        <w:jc w:val="both"/>
+        <w:rPr>
+          <w:rFonts w:hint="eastAsia" w:asciiTheme="minorHAnsi" w:hAnsiTheme="minorHAnsi" w:eastAsiaTheme="minorEastAsia" w:cstheme="minorBidi"/>
+          <w:kern w:val="2"/>
+          <w:sz w:val="21"/>
+          <w:szCs w:val="24"/>
+          <w:lang w:val="en-US" w:eastAsia="zh-CN" w:bidi="ar-SA"/>
+        </w:rPr>
+      </w:pPr>
+      <w:r>
+        <w:rPr>
+          <w:rFonts w:hint="eastAsia" w:asciiTheme="minorHAnsi" w:hAnsiTheme="minorHAnsi" w:eastAsiaTheme="minorEastAsia" w:cstheme="minorBidi"/>
+          <w:kern w:val="2"/>
+          <w:sz w:val="21"/>
+          <w:szCs w:val="24"/>
+          <w:lang w:val="en-US" w:eastAsia="zh-CN" w:bidi="ar-SA"/>
+        </w:rPr>
+        <w:t>- Started：刚按下那一刻</w:t>
+      </w:r>
+    </w:p>
+    <w:p>
+      <w:pPr>
+        <w:widowControl w:val="0"/>
+        <w:numPr>
+          <w:ilvl w:val="0"/>
+          <w:numId w:val="1"/>
+        </w:numPr>
+        <w:ind w:left="0" w:leftChars="0" w:firstLine="420" w:firstLineChars="200"/>
+        <w:jc w:val="both"/>
+        <w:rPr>
+          <w:rFonts w:hint="eastAsia" w:asciiTheme="minorHAnsi" w:hAnsiTheme="minorHAnsi" w:eastAsiaTheme="minorEastAsia" w:cstheme="minorBidi"/>
+          <w:kern w:val="2"/>
+          <w:sz w:val="21"/>
+          <w:szCs w:val="24"/>
+          <w:lang w:val="en-US" w:eastAsia="zh-CN" w:bidi="ar-SA"/>
+        </w:rPr>
+      </w:pPr>
+      <w:r>
+        <w:rPr>
+          <w:rFonts w:hint="eastAsia" w:asciiTheme="minorHAnsi" w:hAnsiTheme="minorHAnsi" w:eastAsiaTheme="minorEastAsia" w:cstheme="minorBidi"/>
+          <w:kern w:val="2"/>
+          <w:sz w:val="21"/>
+          <w:szCs w:val="24"/>
+          <w:lang w:val="en-US" w:eastAsia="zh-CN" w:bidi="ar-SA"/>
+        </w:rPr>
+        <w:t>- Completed：松开时，前提是之前触发过</w:t>
+      </w:r>
+    </w:p>
+    <w:p>
+      <w:pPr>
+        <w:widowControl w:val="0"/>
+        <w:numPr>
+          <w:ilvl w:val="0"/>
+          <w:numId w:val="1"/>
+        </w:numPr>
+        <w:ind w:left="0" w:leftChars="0" w:firstLine="420" w:firstLineChars="200"/>
+        <w:jc w:val="both"/>
+        <w:rPr>
+          <w:rFonts w:hint="eastAsia" w:asciiTheme="minorHAnsi" w:hAnsiTheme="minorHAnsi" w:eastAsiaTheme="minorEastAsia" w:cstheme="minorBidi"/>
+          <w:kern w:val="2"/>
+          <w:sz w:val="21"/>
+          <w:szCs w:val="24"/>
+          <w:lang w:val="en-US" w:eastAsia="zh-CN" w:bidi="ar-SA"/>
+        </w:rPr>
+      </w:pPr>
+      <w:r>
+        <w:rPr>
+          <w:rFonts w:hint="eastAsia" w:asciiTheme="minorHAnsi" w:hAnsiTheme="minorHAnsi" w:eastAsiaTheme="minorEastAsia" w:cstheme="minorBidi"/>
+          <w:kern w:val="2"/>
+          <w:sz w:val="21"/>
+          <w:szCs w:val="24"/>
+          <w:lang w:val="en-US" w:eastAsia="zh-CN" w:bidi="ar-SA"/>
+        </w:rPr>
+        <w:t>- Canceled：中途取消，常和复杂 Trigger 有关</w:t>
+      </w:r>
+    </w:p>
+    <w:p>
+      <w:pPr>
+        <w:widowControl w:val="0"/>
+        <w:ind w:left="0" w:leftChars="0" w:firstLine="420" w:firstLineChars="200"/>
+        <w:jc w:val="both"/>
+        <w:rPr>
+          <w:rFonts w:hint="eastAsia" w:asciiTheme="minorHAnsi" w:hAnsiTheme="minorHAnsi" w:eastAsiaTheme="minorEastAsia" w:cstheme="minorBidi"/>
+          <w:kern w:val="2"/>
+          <w:sz w:val="21"/>
+          <w:szCs w:val="24"/>
+          <w:lang w:val="en-US" w:eastAsia="zh-CN" w:bidi="ar-SA"/>
+        </w:rPr>
+      </w:pPr>
+      <w:r>
+        <w:rPr>
+          <w:rFonts w:hint="eastAsia" w:asciiTheme="minorHAnsi" w:hAnsiTheme="minorHAnsi" w:eastAsiaTheme="minorEastAsia" w:cstheme="minorBidi"/>
+          <w:kern w:val="2"/>
+          <w:sz w:val="21"/>
+          <w:szCs w:val="24"/>
+          <w:lang w:val="en-US" w:eastAsia="zh-CN" w:bidi="ar-SA"/>
+        </w:rPr>
+        <w:t>sprint 想按住才冲刺，推荐这样写：</w:t>
+      </w:r>
+    </w:p>
+    <w:p>
+      <w:pPr>
+        <w:widowControl w:val="0"/>
+        <w:ind w:left="0" w:leftChars="0" w:firstLine="420" w:firstLineChars="200"/>
+        <w:jc w:val="both"/>
+        <w:rPr>
+          <w:rFonts w:hint="eastAsia" w:asciiTheme="minorHAnsi" w:hAnsiTheme="minorHAnsi" w:eastAsiaTheme="minorEastAsia" w:cstheme="minorBidi"/>
+          <w:kern w:val="2"/>
+          <w:sz w:val="21"/>
+          <w:szCs w:val="24"/>
+          <w:lang w:val="en-US" w:eastAsia="zh-CN" w:bidi="ar-SA"/>
+        </w:rPr>
+      </w:pPr>
+      <w:r>
+        <w:rPr>
+          <w:rFonts w:hint="eastAsia" w:asciiTheme="minorHAnsi" w:hAnsiTheme="minorHAnsi" w:eastAsiaTheme="minorEastAsia" w:cstheme="minorBidi"/>
+          <w:kern w:val="2"/>
+          <w:sz w:val="21"/>
+          <w:szCs w:val="24"/>
+          <w:lang w:val="en-US" w:eastAsia="zh-CN" w:bidi="ar-SA"/>
+        </w:rPr>
+        <w:t>EnhancedInputComponent-&gt;BindAction(Input_Sprint, ETriggerEvent::Started, this, &amp;ASCharacter::StartSprint);</w:t>
+      </w:r>
+    </w:p>
+    <w:p>
+      <w:pPr>
+        <w:widowControl w:val="0"/>
+        <w:ind w:left="0" w:leftChars="0" w:firstLine="420" w:firstLineChars="200"/>
+        <w:jc w:val="both"/>
+        <w:rPr>
+          <w:rFonts w:hint="eastAsia" w:asciiTheme="minorHAnsi" w:hAnsiTheme="minorHAnsi" w:eastAsiaTheme="minorEastAsia" w:cstheme="minorBidi"/>
+          <w:kern w:val="2"/>
+          <w:sz w:val="21"/>
+          <w:szCs w:val="24"/>
+          <w:lang w:val="en-US" w:eastAsia="zh-CN" w:bidi="ar-SA"/>
+        </w:rPr>
+      </w:pPr>
+      <w:r>
+        <w:rPr>
+          <w:rFonts w:hint="eastAsia" w:asciiTheme="minorHAnsi" w:hAnsiTheme="minorHAnsi" w:eastAsiaTheme="minorEastAsia" w:cstheme="minorBidi"/>
+          <w:kern w:val="2"/>
+          <w:sz w:val="21"/>
+          <w:szCs w:val="24"/>
+          <w:lang w:val="en-US" w:eastAsia="zh-CN" w:bidi="ar-SA"/>
+        </w:rPr>
+        <w:t>EnhancedInputComponent-&gt;BindAction(Input_Sprint, ETriggerEvent::Completed, this, &amp;ASCharacter::StopSprint);</w:t>
+      </w:r>
+    </w:p>
+    <w:p>
+      <w:pPr>
+        <w:widowControl w:val="0"/>
+        <w:ind w:left="0" w:leftChars="0" w:firstLine="420" w:firstLineChars="200"/>
+        <w:jc w:val="both"/>
+        <w:rPr>
+          <w:rFonts w:eastAsia="宋体"/>
+          <w:b w:val="0"/>
+          <w:i w:val="0"/>
+          <w:strike w:val="0"/>
+          <w:color w:val="auto"/>
+          <w:sz w:val="24"/>
+          <w:u w:val="none"/>
+        </w:rPr>
+      </w:pPr>
+      <w:r>
+        <w:rPr>
+          <w:rFonts w:hint="eastAsia" w:asciiTheme="minorHAnsi" w:hAnsiTheme="minorHAnsi" w:eastAsiaTheme="minorEastAsia" w:cstheme="minorBidi"/>
+          <w:kern w:val="2"/>
+          <w:sz w:val="21"/>
+          <w:szCs w:val="24"/>
+          <w:lang w:val="en-US" w:eastAsia="zh-CN" w:bidi="ar-SA"/>
+        </w:rPr>
+        <w:t>void ASCharacter::StartSprint()</w:t>
+      </w:r>
+    </w:p>
+    <w:p>
+      <w:pPr>
+        <w:widowControl w:val="0"/>
+        <w:ind w:left="0" w:leftChars="0" w:firstLine="420" w:firstLineChars="200"/>
+        <w:jc w:val="both"/>
+        <w:rPr>
+          <w:rFonts w:eastAsia="宋体"/>
+          <w:b w:val="0"/>
+          <w:i w:val="0"/>
+          <w:strike w:val="0"/>
+          <w:color w:val="auto"/>
+          <w:sz w:val="24"/>
+          <w:u w:val="none"/>
+        </w:rPr>
+      </w:pPr>
+      <w:r>
+        <w:rPr>
+          <w:rFonts w:hint="eastAsia" w:asciiTheme="minorHAnsi" w:hAnsiTheme="minorHAnsi" w:eastAsiaTheme="minorEastAsia" w:cstheme="minorBidi"/>
+          <w:kern w:val="2"/>
+          <w:sz w:val="21"/>
+          <w:szCs w:val="24"/>
+          <w:lang w:val="en-US" w:eastAsia="zh-CN" w:bidi="ar-SA"/>
+        </w:rPr>
+        <w:t>GetCharacterMovement()-&gt;MaxWalkSpeed = SprintSpeed;</w:t>
+      </w:r>
+    </w:p>
+    <w:p>
+      <w:pPr>
+        <w:widowControl w:val="0"/>
+        <w:ind w:left="0" w:leftChars="0" w:firstLine="420" w:firstLineChars="200"/>
+        <w:jc w:val="both"/>
+        <w:rPr>
+          <w:rFonts w:eastAsia="宋体"/>
+          <w:b w:val="0"/>
+          <w:i w:val="0"/>
+          <w:strike w:val="0"/>
+          <w:color w:val="auto"/>
+          <w:sz w:val="24"/>
+          <w:u w:val="none"/>
+        </w:rPr>
+      </w:pPr>
+      <w:r>
+        <w:rPr>
+          <w:rFonts w:hint="eastAsia" w:asciiTheme="minorHAnsi" w:hAnsiTheme="minorHAnsi" w:eastAsiaTheme="minorEastAsia" w:cstheme="minorBidi"/>
+          <w:kern w:val="2"/>
+          <w:sz w:val="21"/>
+          <w:szCs w:val="24"/>
+          <w:lang w:val="en-US" w:eastAsia="zh-CN" w:bidi="ar-SA"/>
+        </w:rPr>
+        <w:t>void ASCharacter::StopSprint()</w:t>
+      </w:r>
+    </w:p>
+    <w:p>
+      <w:pPr>
+        <w:widowControl w:val="0"/>
+        <w:ind w:left="0" w:leftChars="0" w:firstLine="420" w:firstLineChars="200"/>
+        <w:jc w:val="both"/>
+        <w:rPr>
+          <w:rFonts w:eastAsia="宋体"/>
+          <w:b w:val="0"/>
+          <w:i w:val="0"/>
+          <w:strike w:val="0"/>
+          <w:color w:val="auto"/>
+          <w:sz w:val="24"/>
+          <w:u w:val="none"/>
+        </w:rPr>
+      </w:pPr>
+      <w:r>
+        <w:rPr>
+          <w:rFonts w:hint="eastAsia" w:asciiTheme="minorHAnsi" w:hAnsiTheme="minorHAnsi" w:eastAsiaTheme="minorEastAsia" w:cstheme="minorBidi"/>
+          <w:kern w:val="2"/>
+          <w:sz w:val="21"/>
+          <w:szCs w:val="24"/>
+          <w:lang w:val="en-US" w:eastAsia="zh-CN" w:bidi="ar-SA"/>
+        </w:rPr>
+        <w:t>GetCharacterMovement()-&gt;MaxWalkSpeed = WalkSpeed;</w:t>
+      </w:r>
+    </w:p>
+    <w:p>
+      <w:pPr>
+        <w:widowControl w:val="0"/>
+        <w:ind w:left="0" w:leftChars="0" w:firstLine="420" w:firstLineChars="200"/>
+        <w:jc w:val="both"/>
+        <w:rPr>
+          <w:rFonts w:hint="eastAsia" w:asciiTheme="minorHAnsi" w:hAnsiTheme="minorHAnsi" w:eastAsiaTheme="minorEastAsia" w:cstheme="minorBidi"/>
+          <w:kern w:val="2"/>
+          <w:sz w:val="21"/>
+          <w:szCs w:val="24"/>
+          <w:lang w:val="en-US" w:eastAsia="zh-CN" w:bidi="ar-SA"/>
+        </w:rPr>
+      </w:pPr>
+      <w:r>
+        <w:rPr>
+          <w:rFonts w:hint="eastAsia" w:asciiTheme="minorHAnsi" w:hAnsiTheme="minorHAnsi" w:eastAsiaTheme="minorEastAsia" w:cstheme="minorBidi"/>
+          <w:kern w:val="2"/>
+          <w:sz w:val="21"/>
+          <w:szCs w:val="24"/>
+          <w:lang w:val="en-US" w:eastAsia="zh-CN" w:bidi="ar-SA"/>
+        </w:rPr>
+        <w:t>开火如果是“按住连发”，也建议分开始和停止：</w:t>
+      </w:r>
+    </w:p>
+    <w:p>
+      <w:pPr>
+        <w:widowControl w:val="0"/>
+        <w:ind w:left="0" w:leftChars="0" w:firstLine="420" w:firstLineChars="200"/>
+        <w:jc w:val="both"/>
+        <w:rPr>
+          <w:rFonts w:hint="eastAsia" w:asciiTheme="minorHAnsi" w:hAnsiTheme="minorHAnsi" w:eastAsiaTheme="minorEastAsia" w:cstheme="minorBidi"/>
+          <w:kern w:val="2"/>
+          <w:sz w:val="21"/>
+          <w:szCs w:val="24"/>
+          <w:lang w:val="en-US" w:eastAsia="zh-CN" w:bidi="ar-SA"/>
+        </w:rPr>
+      </w:pPr>
+      <w:r>
+        <w:rPr>
+          <w:rFonts w:hint="eastAsia" w:asciiTheme="minorHAnsi" w:hAnsiTheme="minorHAnsi" w:eastAsiaTheme="minorEastAsia" w:cstheme="minorBidi"/>
+          <w:kern w:val="2"/>
+          <w:sz w:val="21"/>
+          <w:szCs w:val="24"/>
+          <w:lang w:val="en-US" w:eastAsia="zh-CN" w:bidi="ar-SA"/>
+        </w:rPr>
+        <w:t>EnhancedInputComponent-&gt;BindAction(Input_Fire, ETriggerEvent::Started, this, &amp;ASCharacter::StartFire);</w:t>
+      </w:r>
+    </w:p>
+    <w:p>
+      <w:pPr>
+        <w:widowControl w:val="0"/>
+        <w:ind w:left="0" w:leftChars="0" w:firstLine="420" w:firstLineChars="200"/>
+        <w:jc w:val="both"/>
+        <w:rPr>
+          <w:rFonts w:hint="eastAsia" w:asciiTheme="minorHAnsi" w:hAnsiTheme="minorHAnsi" w:eastAsiaTheme="minorEastAsia" w:cstheme="minorBidi"/>
+          <w:kern w:val="2"/>
+          <w:sz w:val="21"/>
+          <w:szCs w:val="24"/>
+          <w:lang w:val="en-US" w:eastAsia="zh-CN" w:bidi="ar-SA"/>
+        </w:rPr>
+      </w:pPr>
+      <w:r>
+        <w:rPr>
+          <w:rFonts w:hint="eastAsia" w:asciiTheme="minorHAnsi" w:hAnsiTheme="minorHAnsi" w:eastAsiaTheme="minorEastAsia" w:cstheme="minorBidi"/>
+          <w:kern w:val="2"/>
+          <w:sz w:val="21"/>
+          <w:szCs w:val="24"/>
+          <w:lang w:val="en-US" w:eastAsia="zh-CN" w:bidi="ar-SA"/>
+        </w:rPr>
+        <w:t>EnhancedInputComponent-&gt;BindAction(Input_Fire, ETriggerEvent::Completed, this, &amp;ASCharacter::StopFire);</w:t>
+      </w:r>
+    </w:p>
+    <w:p>
+      <w:pPr>
+        <w:widowControl w:val="0"/>
+        <w:ind w:left="0" w:leftChars="0" w:firstLine="420" w:firstLineChars="200"/>
+        <w:jc w:val="both"/>
+        <w:rPr>
+          <w:rFonts w:hint="eastAsia" w:asciiTheme="minorHAnsi" w:hAnsiTheme="minorHAnsi" w:eastAsiaTheme="minorEastAsia" w:cstheme="minorBidi"/>
+          <w:kern w:val="2"/>
+          <w:sz w:val="21"/>
+          <w:szCs w:val="24"/>
+          <w:lang w:val="en-US" w:eastAsia="zh-CN" w:bidi="ar-SA"/>
+        </w:rPr>
+      </w:pPr>
+      <w:r>
+        <w:rPr>
+          <w:rFonts w:hint="eastAsia" w:asciiTheme="minorHAnsi" w:hAnsiTheme="minorHAnsi" w:eastAsiaTheme="minorEastAsia" w:cstheme="minorBidi"/>
+          <w:kern w:val="2"/>
+          <w:sz w:val="21"/>
+          <w:szCs w:val="24"/>
+          <w:lang w:val="en-US" w:eastAsia="zh-CN" w:bidi="ar-SA"/>
+        </w:rPr>
+        <w:t>然后 StartFire() 里开启定时器，按射速调用 Fire()；StopFire() 里清定时器。</w:t>
+      </w:r>
+    </w:p>
+    <w:p>
+      <w:pPr>
+        <w:widowControl w:val="0"/>
+        <w:ind w:left="0" w:leftChars="0" w:firstLine="420" w:firstLineChars="200"/>
+        <w:jc w:val="both"/>
+        <w:rPr>
+          <w:rFonts w:hint="eastAsia" w:asciiTheme="minorHAnsi" w:hAnsiTheme="minorHAnsi" w:eastAsiaTheme="minorEastAsia" w:cstheme="minorBidi"/>
+          <w:kern w:val="2"/>
+          <w:sz w:val="21"/>
+          <w:szCs w:val="24"/>
+          <w:lang w:val="en-US" w:eastAsia="zh-CN" w:bidi="ar-SA"/>
+        </w:rPr>
+      </w:pPr>
+      <w:r>
+        <w:rPr>
+          <w:rFonts w:hint="eastAsia" w:asciiTheme="minorHAnsi" w:hAnsiTheme="minorHAnsi" w:eastAsiaTheme="minorEastAsia" w:cstheme="minorBidi"/>
+          <w:kern w:val="2"/>
+          <w:sz w:val="21"/>
+          <w:szCs w:val="24"/>
+          <w:lang w:val="en-US" w:eastAsia="zh-CN" w:bidi="ar-SA"/>
+        </w:rPr>
+        <w:t>如果你现在这样写：</w:t>
+      </w:r>
+    </w:p>
+    <w:p>
+      <w:pPr>
+        <w:widowControl w:val="0"/>
+        <w:ind w:left="0" w:leftChars="0" w:firstLine="420" w:firstLineChars="200"/>
+        <w:jc w:val="both"/>
+        <w:rPr>
+          <w:rFonts w:hint="eastAsia" w:asciiTheme="minorHAnsi" w:hAnsiTheme="minorHAnsi" w:eastAsiaTheme="minorEastAsia" w:cstheme="minorBidi"/>
+          <w:kern w:val="2"/>
+          <w:sz w:val="21"/>
+          <w:szCs w:val="24"/>
+          <w:lang w:val="en-US" w:eastAsia="zh-CN" w:bidi="ar-SA"/>
+        </w:rPr>
+      </w:pPr>
+      <w:r>
+        <w:rPr>
+          <w:rFonts w:hint="eastAsia" w:asciiTheme="minorHAnsi" w:hAnsiTheme="minorHAnsi" w:eastAsiaTheme="minorEastAsia" w:cstheme="minorBidi"/>
+          <w:kern w:val="2"/>
+          <w:sz w:val="21"/>
+          <w:szCs w:val="24"/>
+          <w:lang w:val="en-US" w:eastAsia="zh-CN" w:bidi="ar-SA"/>
+        </w:rPr>
+        <w:t>EnhancedInputComponent-&gt;BindAction(Input_Fire, ETriggerEvent::Triggered, this, &amp;ASCharacter::Fire);</w:t>
+      </w:r>
+    </w:p>
+    <w:p>
+      <w:pPr>
+        <w:widowControl w:val="0"/>
+        <w:ind w:left="0" w:leftChars="0" w:firstLine="420" w:firstLineChars="200"/>
+        <w:jc w:val="both"/>
+        <w:rPr>
+          <w:rFonts w:hint="eastAsia" w:asciiTheme="minorHAnsi" w:hAnsiTheme="minorHAnsi" w:eastAsiaTheme="minorEastAsia" w:cstheme="minorBidi"/>
+          <w:kern w:val="2"/>
+          <w:sz w:val="21"/>
+          <w:szCs w:val="24"/>
+          <w:lang w:val="en-US" w:eastAsia="zh-CN" w:bidi="ar-SA"/>
+        </w:rPr>
+      </w:pPr>
+      <w:r>
+        <w:rPr>
+          <w:rFonts w:hint="eastAsia" w:asciiTheme="minorHAnsi" w:hAnsiTheme="minorHAnsi" w:eastAsiaTheme="minorEastAsia" w:cstheme="minorBidi"/>
+          <w:kern w:val="2"/>
+          <w:sz w:val="21"/>
+          <w:szCs w:val="24"/>
+          <w:lang w:val="en-US" w:eastAsia="zh-CN" w:bidi="ar-SA"/>
+        </w:rPr>
+        <w:t>在普通按住输入下，Fire() 可能会每帧调用一次，射速会跟帧率绑定，不太适合枪械。半自动用 Started，全自动用 Started +</w:t>
+      </w:r>
+    </w:p>
+    <w:p>
+      <w:pPr>
+        <w:widowControl w:val="0"/>
+        <w:ind w:left="0" w:leftChars="0" w:firstLine="420" w:firstLineChars="200"/>
+        <w:jc w:val="both"/>
+        <w:rPr>
+          <w:rFonts w:hint="eastAsia" w:asciiTheme="minorHAnsi" w:hAnsiTheme="minorHAnsi" w:eastAsiaTheme="minorEastAsia" w:cstheme="minorBidi"/>
+          <w:kern w:val="2"/>
+          <w:sz w:val="21"/>
+          <w:szCs w:val="24"/>
+          <w:lang w:val="en-US" w:eastAsia="zh-CN" w:bidi="ar-SA"/>
+        </w:rPr>
+      </w:pPr>
+      <w:r>
+        <w:rPr>
+          <w:rFonts w:hint="eastAsia" w:asciiTheme="minorHAnsi" w:hAnsiTheme="minorHAnsi" w:eastAsiaTheme="minorEastAsia" w:cstheme="minorBidi"/>
+          <w:kern w:val="2"/>
+          <w:sz w:val="21"/>
+          <w:szCs w:val="24"/>
+          <w:lang w:val="en-US" w:eastAsia="zh-CN" w:bidi="ar-SA"/>
+        </w:rPr>
+        <w:t>Timer + Completed 更稳。</w:t>
+      </w:r>
+    </w:p>
+    <w:p>
+      <w:pPr>
+        <w:widowControl w:val="0"/>
+        <w:ind w:left="0" w:leftChars="0" w:firstLine="420" w:firstLineChars="200"/>
+        <w:jc w:val="both"/>
+        <w:rPr>
+          <w:rFonts w:hint="eastAsia" w:asciiTheme="minorHAnsi" w:hAnsiTheme="minorHAnsi" w:eastAsiaTheme="minorEastAsia" w:cstheme="minorBidi"/>
+          <w:kern w:val="2"/>
+          <w:sz w:val="21"/>
+          <w:szCs w:val="24"/>
+          <w:lang w:val="en-US" w:eastAsia="zh-CN" w:bidi="ar-SA"/>
+        </w:rPr>
+      </w:pPr>
+      <w:r>
+        <w:rPr>
+          <w:rFonts w:hint="eastAsia" w:asciiTheme="minorHAnsi" w:hAnsiTheme="minorHAnsi" w:eastAsiaTheme="minorEastAsia" w:cstheme="minorBidi"/>
+          <w:kern w:val="2"/>
+          <w:sz w:val="21"/>
+          <w:szCs w:val="24"/>
+          <w:lang w:val="en-US" w:eastAsia="zh-CN" w:bidi="ar-SA"/>
+        </w:rPr>
+        <w:t>另外检查一下 Input_Fire / Input_Sprint 这个 Input Action 资产里有没有加 Pressed Trigger。如果加了，它就会更像“按下一次</w:t>
+      </w:r>
+    </w:p>
+    <w:p>
+      <w:pPr>
+        <w:widowControl w:val="0"/>
+        <w:ind w:left="0" w:leftChars="0" w:firstLine="420" w:firstLineChars="200"/>
+        <w:jc w:val="both"/>
+        <w:rPr>
+          <w:rFonts w:hint="eastAsia" w:asciiTheme="minorHAnsi" w:hAnsiTheme="minorHAnsi" w:eastAsiaTheme="minorEastAsia" w:cstheme="minorBidi"/>
+          <w:kern w:val="2"/>
+          <w:sz w:val="21"/>
+          <w:szCs w:val="24"/>
+          <w:lang w:val="en-US" w:eastAsia="zh-CN" w:bidi="ar-SA"/>
+        </w:rPr>
+      </w:pPr>
+      <w:r>
+        <w:rPr>
+          <w:rFonts w:hint="eastAsia" w:asciiTheme="minorHAnsi" w:hAnsiTheme="minorHAnsi" w:eastAsiaTheme="minorEastAsia" w:cstheme="minorBidi"/>
+          <w:kern w:val="2"/>
+          <w:sz w:val="21"/>
+          <w:szCs w:val="24"/>
+          <w:lang w:val="en-US" w:eastAsia="zh-CN" w:bidi="ar-SA"/>
+        </w:rPr>
+        <w:t>触发一次”。</w:t>
+      </w:r>
+    </w:p>
+    <w:p>
+      <w:pPr>
+        <w:widowControl w:val="0"/>
+        <w:numPr>
+          <w:ilvl w:val="0"/>
+          <w:numId w:val="0"/>
+        </w:numPr>
+        <w:tabs>
+          <w:tab w:val="left" w:pos="312"/>
+        </w:tabs>
+        <w:jc w:val="left"/>
+        <w:rPr>
           <w:rFonts w:hint="default"/>
           <w:lang w:val="en-US" w:eastAsia="zh-CN"/>
         </w:rPr>
       </w:pPr>
-      <w:r>
+    </w:p>
+    <w:p>
+      <w:pPr>
+        <w:widowControl w:val="0"/>
+        <w:numPr>
+          <w:ilvl w:val="0"/>
+          <w:numId w:val="1"/>
+        </w:numPr>
+        <w:ind w:left="0" w:leftChars="0" w:firstLine="420" w:firstLineChars="200"/>
+        <w:jc w:val="left"/>
         <w:rPr>
           <w:rFonts w:hint="eastAsia"/>
           <w:lang w:val="en-US" w:eastAsia="zh-CN"/>
         </w:rPr>
-        <w:t>socket的绑定</w:t>
-      </w:r>
+      </w:pPr>
+      <w:r>
+        <w:rPr>
+          <w:rFonts w:hint="eastAsia"/>
+          <w:lang w:val="en-US" w:eastAsia="zh-CN"/>
+        </w:rPr>
+        <w:t>aim时不能sprint，但是sprint的时候可以aim，然后直接打断sprint</w:t>
+      </w:r>
+    </w:p>
+    <w:p>
+      <w:pPr>
+        <w:widowControl w:val="0"/>
+        <w:numPr>
+          <w:ilvl w:val="0"/>
+          <w:numId w:val="1"/>
+        </w:numPr>
+        <w:ind w:left="0" w:leftChars="0" w:firstLine="420" w:firstLineChars="200"/>
+        <w:jc w:val="left"/>
+        <w:rPr>
+          <w:rFonts w:hint="default"/>
+          <w:lang w:val="en-US" w:eastAsia="zh-CN"/>
+        </w:rPr>
+      </w:pPr>
+      <w:r>
+        <w:rPr>
+          <w:rFonts w:hint="eastAsia"/>
+          <w:lang w:val="en-US" w:eastAsia="zh-CN"/>
+        </w:rPr>
+        <w:t>我这里设置的是无惯性，在stopmove里面是这样的，也就是一旦停止moveiinput，则速度立马变成0？？</w:t>
+      </w:r>
+    </w:p>
+    <w:p>
+      <w:pPr>
+        <w:widowControl w:val="0"/>
+        <w:numPr>
+          <w:ilvl w:val="0"/>
+          <w:numId w:val="1"/>
+        </w:numPr>
+        <w:ind w:left="0" w:leftChars="0" w:firstLine="420" w:firstLineChars="200"/>
+        <w:jc w:val="left"/>
+        <w:rPr>
+          <w:rFonts w:hint="default"/>
+          <w:lang w:val="en-US" w:eastAsia="zh-CN"/>
+        </w:rPr>
+      </w:pPr>
+      <w:r>
+        <w:rPr>
+          <w:rFonts w:hint="eastAsia"/>
+          <w:lang w:val="en-US" w:eastAsia="zh-CN"/>
+        </w:rPr>
+        <w:t>到时候记得那locomotion的那个start end都加入进去，这样的话动作会更流畅，现在还只是单纯的blend</w:t>
+      </w:r>
+    </w:p>
+    <w:p>
+      <w:pPr>
+        <w:widowControl w:val="0"/>
+        <w:numPr>
+          <w:ilvl w:val="0"/>
+          <w:numId w:val="1"/>
+        </w:numPr>
+        <w:ind w:left="0" w:leftChars="0" w:firstLine="420" w:firstLineChars="200"/>
+        <w:jc w:val="left"/>
+        <w:rPr>
+          <w:rFonts w:hint="default"/>
+          <w:lang w:val="en-US" w:eastAsia="zh-CN"/>
+        </w:rPr>
+      </w:pPr>
+      <w:r>
+        <w:rPr>
+          <w:rFonts w:hint="eastAsia"/>
+          <w:lang w:val="en-US" w:eastAsia="zh-CN"/>
+        </w:rPr>
+        <w:t>就是现在是把枪设置成no collision，意思就是枪会卡到枪里面去！！！！！！</w:t>
+      </w:r>
+    </w:p>
+    <w:p>
+      <w:pPr>
+        <w:widowControl w:val="0"/>
+        <w:numPr>
+          <w:ilvl w:val="0"/>
+          <w:numId w:val="1"/>
+        </w:numPr>
+        <w:ind w:left="0" w:leftChars="0" w:firstLine="420" w:firstLineChars="200"/>
+        <w:jc w:val="left"/>
+        <w:rPr>
+          <w:rFonts w:hint="default"/>
+          <w:lang w:val="en-US" w:eastAsia="zh-CN"/>
+        </w:rPr>
+      </w:pPr>
+      <w:r>
+        <w:rPr>
+          <w:rFonts w:hint="eastAsia"/>
+          <w:lang w:val="en-US" w:eastAsia="zh-CN"/>
+        </w:rPr>
+        <w:t>子弹没发射出去</w:t>
+      </w:r>
+      <w:bookmarkStart w:id="0" w:name="_GoBack"/>
+      <w:bookmarkEnd w:id="0"/>
     </w:p>
     <w:sectPr>
       <w:pgSz w:w="11906" w:h="16838"/>
@@ -193,7 +911,7 @@
   <w:docDefaults>
     <w:rPrDefault>
       <w:rPr>
-        <w:rFonts w:asciiTheme="minorHAnsi" w:hAnsiTheme="minorHAnsi" w:eastAsiaTheme="minorEastAsia" w:cstheme="minorBidi"/>
+        <w:rFonts w:ascii="Times New Roman" w:hAnsi="Times New Roman" w:eastAsia="宋体" w:cs="Times New Roman"/>
       </w:rPr>
     </w:rPrDefault>
     <w:pPrDefault/>
@@ -482,6 +1200,143 @@
       </w:tblCellMar>
     </w:tblPr>
   </w:style>
+  <w:style w:type="character" w:customStyle="1" w:styleId="4">
+    <w:name w:val="s4"/>
+    <w:basedOn w:val="3"/>
+    <w:uiPriority w:val="0"/>
+    <w:rPr>
+      <w:color w:val="6BC0C2"/>
+    </w:rPr>
+  </w:style>
+  <w:style w:type="character" w:customStyle="1" w:styleId="5">
+    <w:name w:val="s1"/>
+    <w:basedOn w:val="3"/>
+    <w:uiPriority w:val="0"/>
+    <w:rPr>
+      <w:color w:val="E0E0E0"/>
+    </w:rPr>
+  </w:style>
+  <w:style w:type="character" w:customStyle="1" w:styleId="6">
+    <w:name w:val="s3"/>
+    <w:basedOn w:val="3"/>
+    <w:uiPriority w:val="0"/>
+    <w:rPr>
+      <w:color w:val="EDEDED"/>
+    </w:rPr>
+  </w:style>
+  <w:style w:type="paragraph" w:customStyle="1" w:styleId="7">
+    <w:name w:val="p3"/>
+    <w:basedOn w:val="1"/>
+    <w:uiPriority w:val="0"/>
+    <w:pPr>
+      <w:shd w:val="clear" w:fill="191D27"/>
+      <w:spacing w:before="0" w:beforeAutospacing="0" w:after="0" w:afterAutospacing="0"/>
+      <w:ind w:left="0" w:right="0"/>
+      <w:jc w:val="left"/>
+    </w:pPr>
+    <w:rPr>
+      <w:rFonts w:ascii="menlo" w:hAnsi="menlo" w:eastAsia="menlo" w:cs="menlo"/>
+      <w:color w:val="E0E0E0"/>
+      <w:kern w:val="0"/>
+      <w:sz w:val="24"/>
+      <w:szCs w:val="24"/>
+      <w:lang w:val="en-US" w:eastAsia="zh-CN" w:bidi="ar"/>
+    </w:rPr>
+  </w:style>
+  <w:style w:type="character" w:customStyle="1" w:styleId="8">
+    <w:name w:val="s7"/>
+    <w:basedOn w:val="3"/>
+    <w:uiPriority w:val="0"/>
+    <w:rPr>
+      <w:color w:val="8186A3"/>
+    </w:rPr>
+  </w:style>
+  <w:style w:type="paragraph" w:customStyle="1" w:styleId="9">
+    <w:name w:val="p1"/>
+    <w:basedOn w:val="1"/>
+    <w:uiPriority w:val="0"/>
+    <w:pPr>
+      <w:shd w:val="clear" w:fill="191D27"/>
+      <w:spacing w:before="0" w:beforeAutospacing="0" w:after="0" w:afterAutospacing="0"/>
+      <w:ind w:left="0" w:right="0"/>
+      <w:jc w:val="left"/>
+    </w:pPr>
+    <w:rPr>
+      <w:rFonts w:hint="default" w:ascii="menlo" w:hAnsi="menlo" w:eastAsia="menlo" w:cs="menlo"/>
+      <w:color w:val="6BC0C2"/>
+      <w:kern w:val="0"/>
+      <w:sz w:val="24"/>
+      <w:szCs w:val="24"/>
+      <w:lang w:val="en-US" w:eastAsia="zh-CN" w:bidi="ar"/>
+    </w:rPr>
+  </w:style>
+  <w:style w:type="paragraph" w:customStyle="1" w:styleId="10">
+    <w:name w:val="p4"/>
+    <w:basedOn w:val="1"/>
+    <w:uiPriority w:val="0"/>
+    <w:pPr>
+      <w:shd w:val="clear" w:fill="191D27"/>
+      <w:spacing w:before="0" w:beforeAutospacing="0" w:after="0" w:afterAutospacing="0"/>
+      <w:ind w:left="0" w:right="0"/>
+      <w:jc w:val="left"/>
+    </w:pPr>
+    <w:rPr>
+      <w:rFonts w:hint="default" w:ascii="menlo" w:hAnsi="menlo" w:eastAsia="menlo" w:cs="menlo"/>
+      <w:color w:val="C2CBF1"/>
+      <w:kern w:val="0"/>
+      <w:sz w:val="24"/>
+      <w:szCs w:val="24"/>
+      <w:lang w:val="en-US" w:eastAsia="zh-CN" w:bidi="ar"/>
+    </w:rPr>
+  </w:style>
+  <w:style w:type="paragraph" w:customStyle="1" w:styleId="11">
+    <w:name w:val="p2"/>
+    <w:basedOn w:val="1"/>
+    <w:uiPriority w:val="0"/>
+    <w:pPr>
+      <w:shd w:val="clear" w:fill="191D27"/>
+      <w:spacing w:before="0" w:beforeAutospacing="0" w:after="0" w:afterAutospacing="0"/>
+      <w:ind w:left="0" w:right="0"/>
+      <w:jc w:val="left"/>
+    </w:pPr>
+    <w:rPr>
+      <w:rFonts w:hint="default" w:ascii="menlo" w:hAnsi="menlo" w:eastAsia="menlo" w:cs="menlo"/>
+      <w:color w:val="E0E0E0"/>
+      <w:kern w:val="0"/>
+      <w:sz w:val="24"/>
+      <w:szCs w:val="24"/>
+      <w:lang w:val="en-US" w:eastAsia="zh-CN" w:bidi="ar"/>
+    </w:rPr>
+  </w:style>
+  <w:style w:type="character" w:customStyle="1" w:styleId="12">
+    <w:name w:val="s6"/>
+    <w:basedOn w:val="3"/>
+    <w:uiPriority w:val="0"/>
+    <w:rPr>
+      <w:color w:val="77A2F8"/>
+    </w:rPr>
+  </w:style>
+  <w:style w:type="character" w:customStyle="1" w:styleId="13">
+    <w:name w:val="s2"/>
+    <w:basedOn w:val="3"/>
+    <w:uiPriority w:val="0"/>
+  </w:style>
+  <w:style w:type="character" w:customStyle="1" w:styleId="14">
+    <w:name w:val="s8"/>
+    <w:basedOn w:val="3"/>
+    <w:uiPriority w:val="0"/>
+    <w:rPr>
+      <w:color w:val="BE90F5"/>
+    </w:rPr>
+  </w:style>
+  <w:style w:type="character" w:customStyle="1" w:styleId="15">
+    <w:name w:val="s5"/>
+    <w:basedOn w:val="3"/>
+    <w:uiPriority w:val="0"/>
+    <w:rPr>
+      <w:color w:val="85DDCB"/>
+    </w:rPr>
+  </w:style>
 </w:styles>
 </file>
 

</xml_diff>

<commit_message>
done with meta sound(some small bug) & niagara muzzle flash
</commit_message>
<xml_diff>
--- a/问题StellarFront.docx
+++ b/问题StellarFront.docx
@@ -140,6 +140,12 @@
         </w:numPr>
         <w:ind w:left="0" w:leftChars="0" w:firstLine="0" w:firstLineChars="0"/>
         <w:jc w:val="both"/>
+        <w:rPr>
+          <w:rFonts w:hint="default"/>
+          <w:lang w:val="en-US" w:eastAsia="zh-CN"/>
+        </w:rPr>
+      </w:pPr>
+      <w:r>
         <w:rPr>
           <w:rFonts w:hint="eastAsia" w:asciiTheme="minorHAnsi" w:hAnsiTheme="minorHAnsi" w:eastAsiaTheme="minorEastAsia" w:cstheme="minorBidi"/>
           <w:kern w:val="2"/>
@@ -147,618 +153,8 @@
           <w:szCs w:val="24"/>
           <w:lang w:val="en-US" w:eastAsia="zh-CN" w:bidi="ar-SA"/>
         </w:rPr>
-      </w:pPr>
-      <w:r>
-        <w:rPr>
-          <w:rFonts w:hint="eastAsia" w:asciiTheme="minorHAnsi" w:hAnsiTheme="minorHAnsi" w:eastAsiaTheme="minorEastAsia" w:cstheme="minorBidi"/>
-          <w:kern w:val="2"/>
-          <w:sz w:val="21"/>
-          <w:szCs w:val="24"/>
-          <w:lang w:val="en-US" w:eastAsia="zh-CN" w:bidi="ar-SA"/>
-        </w:rPr>
         <w:t>不是。ETriggerEvent::Triggered 不是固定“按一下触发一次”，它表示 Input Action 的触发条件正在满足。</w:t>
       </w:r>
-    </w:p>
-    <w:p>
-      <w:pPr>
-        <w:widowControl w:val="0"/>
-        <w:numPr>
-          <w:ilvl w:val="0"/>
-          <w:numId w:val="1"/>
-        </w:numPr>
-        <w:ind w:left="0" w:leftChars="0" w:firstLine="420" w:firstLineChars="200"/>
-        <w:jc w:val="both"/>
-        <w:rPr>
-          <w:rFonts w:hint="eastAsia" w:asciiTheme="minorHAnsi" w:hAnsiTheme="minorHAnsi" w:eastAsiaTheme="minorEastAsia" w:cstheme="minorBidi"/>
-          <w:kern w:val="2"/>
-          <w:sz w:val="21"/>
-          <w:szCs w:val="24"/>
-          <w:lang w:val="en-US" w:eastAsia="zh-CN" w:bidi="ar-SA"/>
-        </w:rPr>
-      </w:pPr>
-      <w:r>
-        <w:rPr>
-          <w:rFonts w:hint="eastAsia" w:asciiTheme="minorHAnsi" w:hAnsiTheme="minorHAnsi" w:eastAsiaTheme="minorEastAsia" w:cstheme="minorBidi"/>
-          <w:kern w:val="2"/>
-          <w:sz w:val="21"/>
-          <w:szCs w:val="24"/>
-          <w:lang w:val="en-US" w:eastAsia="zh-CN" w:bidi="ar-SA"/>
-        </w:rPr>
-        <w:t>对普通按键来说：</w:t>
-      </w:r>
-    </w:p>
-    <w:p>
-      <w:pPr>
-        <w:widowControl w:val="0"/>
-        <w:numPr>
-          <w:ilvl w:val="0"/>
-          <w:numId w:val="1"/>
-        </w:numPr>
-        <w:ind w:left="0" w:leftChars="0" w:firstLine="420" w:firstLineChars="200"/>
-        <w:jc w:val="both"/>
-        <w:rPr>
-          <w:rFonts w:hint="eastAsia" w:asciiTheme="minorHAnsi" w:hAnsiTheme="minorHAnsi" w:eastAsiaTheme="minorEastAsia" w:cstheme="minorBidi"/>
-          <w:kern w:val="2"/>
-          <w:sz w:val="21"/>
-          <w:szCs w:val="24"/>
-          <w:lang w:val="en-US" w:eastAsia="zh-CN" w:bidi="ar-SA"/>
-        </w:rPr>
-      </w:pPr>
-      <w:r>
-        <w:rPr>
-          <w:rFonts w:hint="eastAsia" w:asciiTheme="minorHAnsi" w:hAnsiTheme="minorHAnsi" w:eastAsiaTheme="minorEastAsia" w:cstheme="minorBidi"/>
-          <w:kern w:val="2"/>
-          <w:sz w:val="21"/>
-          <w:szCs w:val="24"/>
-          <w:lang w:val="en-US" w:eastAsia="zh-CN" w:bidi="ar-SA"/>
-        </w:rPr>
-        <w:t>- 没加特殊 Trigger，或用 Down：Triggered 通常会在按住期间每帧触发</w:t>
-      </w:r>
-    </w:p>
-    <w:p>
-      <w:pPr>
-        <w:widowControl w:val="0"/>
-        <w:numPr>
-          <w:ilvl w:val="0"/>
-          <w:numId w:val="1"/>
-        </w:numPr>
-        <w:ind w:left="0" w:leftChars="0" w:firstLine="420" w:firstLineChars="200"/>
-        <w:jc w:val="both"/>
-        <w:rPr>
-          <w:rFonts w:hint="eastAsia" w:asciiTheme="minorHAnsi" w:hAnsiTheme="minorHAnsi" w:eastAsiaTheme="minorEastAsia" w:cstheme="minorBidi"/>
-          <w:kern w:val="2"/>
-          <w:sz w:val="21"/>
-          <w:szCs w:val="24"/>
-          <w:lang w:val="en-US" w:eastAsia="zh-CN" w:bidi="ar-SA"/>
-        </w:rPr>
-      </w:pPr>
-      <w:r>
-        <w:rPr>
-          <w:rFonts w:hint="eastAsia" w:asciiTheme="minorHAnsi" w:hAnsiTheme="minorHAnsi" w:eastAsiaTheme="minorEastAsia" w:cstheme="minorBidi"/>
-          <w:kern w:val="2"/>
-          <w:sz w:val="21"/>
-          <w:szCs w:val="24"/>
-          <w:lang w:val="en-US" w:eastAsia="zh-CN" w:bidi="ar-SA"/>
-        </w:rPr>
-        <w:t>- 用 Pressed Trigger：通常是按下瞬间触发一次</w:t>
-      </w:r>
-    </w:p>
-    <w:p>
-      <w:pPr>
-        <w:widowControl w:val="0"/>
-        <w:numPr>
-          <w:ilvl w:val="0"/>
-          <w:numId w:val="1"/>
-        </w:numPr>
-        <w:ind w:left="0" w:leftChars="0" w:firstLine="420" w:firstLineChars="200"/>
-        <w:jc w:val="both"/>
-        <w:rPr>
-          <w:rFonts w:hint="eastAsia" w:asciiTheme="minorHAnsi" w:hAnsiTheme="minorHAnsi" w:eastAsiaTheme="minorEastAsia" w:cstheme="minorBidi"/>
-          <w:kern w:val="2"/>
-          <w:sz w:val="21"/>
-          <w:szCs w:val="24"/>
-          <w:lang w:val="en-US" w:eastAsia="zh-CN" w:bidi="ar-SA"/>
-        </w:rPr>
-      </w:pPr>
-      <w:r>
-        <w:rPr>
-          <w:rFonts w:hint="eastAsia" w:asciiTheme="minorHAnsi" w:hAnsiTheme="minorHAnsi" w:eastAsiaTheme="minorEastAsia" w:cstheme="minorBidi"/>
-          <w:kern w:val="2"/>
-          <w:sz w:val="21"/>
-          <w:szCs w:val="24"/>
-          <w:lang w:val="en-US" w:eastAsia="zh-CN" w:bidi="ar-SA"/>
-        </w:rPr>
-        <w:t>- Started：刚按下那一刻</w:t>
-      </w:r>
-    </w:p>
-    <w:p>
-      <w:pPr>
-        <w:widowControl w:val="0"/>
-        <w:numPr>
-          <w:ilvl w:val="0"/>
-          <w:numId w:val="1"/>
-        </w:numPr>
-        <w:ind w:left="0" w:leftChars="0" w:firstLine="420" w:firstLineChars="200"/>
-        <w:jc w:val="both"/>
-        <w:rPr>
-          <w:rFonts w:hint="eastAsia" w:asciiTheme="minorHAnsi" w:hAnsiTheme="minorHAnsi" w:eastAsiaTheme="minorEastAsia" w:cstheme="minorBidi"/>
-          <w:kern w:val="2"/>
-          <w:sz w:val="21"/>
-          <w:szCs w:val="24"/>
-          <w:lang w:val="en-US" w:eastAsia="zh-CN" w:bidi="ar-SA"/>
-        </w:rPr>
-      </w:pPr>
-      <w:r>
-        <w:rPr>
-          <w:rFonts w:hint="eastAsia" w:asciiTheme="minorHAnsi" w:hAnsiTheme="minorHAnsi" w:eastAsiaTheme="minorEastAsia" w:cstheme="minorBidi"/>
-          <w:kern w:val="2"/>
-          <w:sz w:val="21"/>
-          <w:szCs w:val="24"/>
-          <w:lang w:val="en-US" w:eastAsia="zh-CN" w:bidi="ar-SA"/>
-        </w:rPr>
-        <w:t>- Completed：松开时，前提是之前触发过</w:t>
-      </w:r>
-    </w:p>
-    <w:p>
-      <w:pPr>
-        <w:widowControl w:val="0"/>
-        <w:numPr>
-          <w:ilvl w:val="0"/>
-          <w:numId w:val="1"/>
-        </w:numPr>
-        <w:ind w:left="0" w:leftChars="0" w:firstLine="420" w:firstLineChars="200"/>
-        <w:jc w:val="both"/>
-        <w:rPr>
-          <w:rFonts w:hint="eastAsia" w:asciiTheme="minorHAnsi" w:hAnsiTheme="minorHAnsi" w:eastAsiaTheme="minorEastAsia" w:cstheme="minorBidi"/>
-          <w:kern w:val="2"/>
-          <w:sz w:val="21"/>
-          <w:szCs w:val="24"/>
-          <w:lang w:val="en-US" w:eastAsia="zh-CN" w:bidi="ar-SA"/>
-        </w:rPr>
-      </w:pPr>
-      <w:r>
-        <w:rPr>
-          <w:rFonts w:hint="eastAsia" w:asciiTheme="minorHAnsi" w:hAnsiTheme="minorHAnsi" w:eastAsiaTheme="minorEastAsia" w:cstheme="minorBidi"/>
-          <w:kern w:val="2"/>
-          <w:sz w:val="21"/>
-          <w:szCs w:val="24"/>
-          <w:lang w:val="en-US" w:eastAsia="zh-CN" w:bidi="ar-SA"/>
-        </w:rPr>
-        <w:t>- Canceled：中途取消，常和复杂 Trigger 有关</w:t>
-      </w:r>
-    </w:p>
-    <w:p>
-      <w:pPr>
-        <w:widowControl w:val="0"/>
-        <w:ind w:left="0" w:leftChars="0" w:firstLine="420" w:firstLineChars="200"/>
-        <w:jc w:val="both"/>
-        <w:rPr>
-          <w:rFonts w:hint="eastAsia" w:asciiTheme="minorHAnsi" w:hAnsiTheme="minorHAnsi" w:eastAsiaTheme="minorEastAsia" w:cstheme="minorBidi"/>
-          <w:kern w:val="2"/>
-          <w:sz w:val="21"/>
-          <w:szCs w:val="24"/>
-          <w:lang w:val="en-US" w:eastAsia="zh-CN" w:bidi="ar-SA"/>
-        </w:rPr>
-      </w:pPr>
-      <w:r>
-        <w:rPr>
-          <w:rFonts w:hint="eastAsia" w:asciiTheme="minorHAnsi" w:hAnsiTheme="minorHAnsi" w:eastAsiaTheme="minorEastAsia" w:cstheme="minorBidi"/>
-          <w:kern w:val="2"/>
-          <w:sz w:val="21"/>
-          <w:szCs w:val="24"/>
-          <w:lang w:val="en-US" w:eastAsia="zh-CN" w:bidi="ar-SA"/>
-        </w:rPr>
-        <w:t>sprint 想按住才冲刺，推荐这样写：</w:t>
-      </w:r>
-    </w:p>
-    <w:p>
-      <w:pPr>
-        <w:widowControl w:val="0"/>
-        <w:ind w:left="0" w:leftChars="0" w:firstLine="420" w:firstLineChars="200"/>
-        <w:jc w:val="both"/>
-        <w:rPr>
-          <w:rFonts w:hint="eastAsia" w:asciiTheme="minorHAnsi" w:hAnsiTheme="minorHAnsi" w:eastAsiaTheme="minorEastAsia" w:cstheme="minorBidi"/>
-          <w:kern w:val="2"/>
-          <w:sz w:val="21"/>
-          <w:szCs w:val="24"/>
-          <w:lang w:val="en-US" w:eastAsia="zh-CN" w:bidi="ar-SA"/>
-        </w:rPr>
-      </w:pPr>
-      <w:r>
-        <w:rPr>
-          <w:rFonts w:hint="eastAsia" w:asciiTheme="minorHAnsi" w:hAnsiTheme="minorHAnsi" w:eastAsiaTheme="minorEastAsia" w:cstheme="minorBidi"/>
-          <w:kern w:val="2"/>
-          <w:sz w:val="21"/>
-          <w:szCs w:val="24"/>
-          <w:lang w:val="en-US" w:eastAsia="zh-CN" w:bidi="ar-SA"/>
-        </w:rPr>
-        <w:t>EnhancedInputComponent-&gt;BindAction(Input_Sprint, ETriggerEvent::Started, this, &amp;ASCharacter::StartSprint);</w:t>
-      </w:r>
-    </w:p>
-    <w:p>
-      <w:pPr>
-        <w:widowControl w:val="0"/>
-        <w:ind w:left="0" w:leftChars="0" w:firstLine="420" w:firstLineChars="200"/>
-        <w:jc w:val="both"/>
-        <w:rPr>
-          <w:rFonts w:hint="eastAsia" w:asciiTheme="minorHAnsi" w:hAnsiTheme="minorHAnsi" w:eastAsiaTheme="minorEastAsia" w:cstheme="minorBidi"/>
-          <w:kern w:val="2"/>
-          <w:sz w:val="21"/>
-          <w:szCs w:val="24"/>
-          <w:lang w:val="en-US" w:eastAsia="zh-CN" w:bidi="ar-SA"/>
-        </w:rPr>
-      </w:pPr>
-      <w:r>
-        <w:rPr>
-          <w:rFonts w:hint="eastAsia" w:asciiTheme="minorHAnsi" w:hAnsiTheme="minorHAnsi" w:eastAsiaTheme="minorEastAsia" w:cstheme="minorBidi"/>
-          <w:kern w:val="2"/>
-          <w:sz w:val="21"/>
-          <w:szCs w:val="24"/>
-          <w:lang w:val="en-US" w:eastAsia="zh-CN" w:bidi="ar-SA"/>
-        </w:rPr>
-        <w:t>EnhancedInputComponent-&gt;BindAction(Input_Sprint, ETriggerEvent::Completed, this, &amp;ASCharacter::StopSprint);</w:t>
-      </w:r>
-    </w:p>
-    <w:p>
-      <w:pPr>
-        <w:widowControl w:val="0"/>
-        <w:ind w:left="0" w:leftChars="0" w:firstLine="420" w:firstLineChars="200"/>
-        <w:jc w:val="both"/>
-        <w:rPr>
-          <w:rFonts w:eastAsia="宋体"/>
-          <w:b w:val="0"/>
-          <w:i w:val="0"/>
-          <w:strike w:val="0"/>
-          <w:color w:val="auto"/>
-          <w:sz w:val="24"/>
-          <w:u w:val="none"/>
-        </w:rPr>
-      </w:pPr>
-      <w:r>
-        <w:rPr>
-          <w:rFonts w:hint="eastAsia" w:asciiTheme="minorHAnsi" w:hAnsiTheme="minorHAnsi" w:eastAsiaTheme="minorEastAsia" w:cstheme="minorBidi"/>
-          <w:kern w:val="2"/>
-          <w:sz w:val="21"/>
-          <w:szCs w:val="24"/>
-          <w:lang w:val="en-US" w:eastAsia="zh-CN" w:bidi="ar-SA"/>
-        </w:rPr>
-        <w:t>void ASCharacter::StartSprint()</w:t>
-      </w:r>
-    </w:p>
-    <w:p>
-      <w:pPr>
-        <w:widowControl w:val="0"/>
-        <w:ind w:left="0" w:leftChars="0" w:firstLine="420" w:firstLineChars="200"/>
-        <w:jc w:val="both"/>
-        <w:rPr>
-          <w:rFonts w:eastAsia="宋体"/>
-          <w:b w:val="0"/>
-          <w:i w:val="0"/>
-          <w:strike w:val="0"/>
-          <w:color w:val="auto"/>
-          <w:sz w:val="24"/>
-          <w:u w:val="none"/>
-        </w:rPr>
-      </w:pPr>
-      <w:r>
-        <w:rPr>
-          <w:rFonts w:hint="eastAsia" w:asciiTheme="minorHAnsi" w:hAnsiTheme="minorHAnsi" w:eastAsiaTheme="minorEastAsia" w:cstheme="minorBidi"/>
-          <w:kern w:val="2"/>
-          <w:sz w:val="21"/>
-          <w:szCs w:val="24"/>
-          <w:lang w:val="en-US" w:eastAsia="zh-CN" w:bidi="ar-SA"/>
-        </w:rPr>
-        <w:t>GetCharacterMovement()-&gt;MaxWalkSpeed = SprintSpeed;</w:t>
-      </w:r>
-    </w:p>
-    <w:p>
-      <w:pPr>
-        <w:widowControl w:val="0"/>
-        <w:ind w:left="0" w:leftChars="0" w:firstLine="420" w:firstLineChars="200"/>
-        <w:jc w:val="both"/>
-        <w:rPr>
-          <w:rFonts w:eastAsia="宋体"/>
-          <w:b w:val="0"/>
-          <w:i w:val="0"/>
-          <w:strike w:val="0"/>
-          <w:color w:val="auto"/>
-          <w:sz w:val="24"/>
-          <w:u w:val="none"/>
-        </w:rPr>
-      </w:pPr>
-      <w:r>
-        <w:rPr>
-          <w:rFonts w:hint="eastAsia" w:asciiTheme="minorHAnsi" w:hAnsiTheme="minorHAnsi" w:eastAsiaTheme="minorEastAsia" w:cstheme="minorBidi"/>
-          <w:kern w:val="2"/>
-          <w:sz w:val="21"/>
-          <w:szCs w:val="24"/>
-          <w:lang w:val="en-US" w:eastAsia="zh-CN" w:bidi="ar-SA"/>
-        </w:rPr>
-        <w:t>void ASCharacter::StopSprint()</w:t>
-      </w:r>
-    </w:p>
-    <w:p>
-      <w:pPr>
-        <w:widowControl w:val="0"/>
-        <w:ind w:left="0" w:leftChars="0" w:firstLine="420" w:firstLineChars="200"/>
-        <w:jc w:val="both"/>
-        <w:rPr>
-          <w:rFonts w:eastAsia="宋体"/>
-          <w:b w:val="0"/>
-          <w:i w:val="0"/>
-          <w:strike w:val="0"/>
-          <w:color w:val="auto"/>
-          <w:sz w:val="24"/>
-          <w:u w:val="none"/>
-        </w:rPr>
-      </w:pPr>
-      <w:r>
-        <w:rPr>
-          <w:rFonts w:hint="eastAsia" w:asciiTheme="minorHAnsi" w:hAnsiTheme="minorHAnsi" w:eastAsiaTheme="minorEastAsia" w:cstheme="minorBidi"/>
-          <w:kern w:val="2"/>
-          <w:sz w:val="21"/>
-          <w:szCs w:val="24"/>
-          <w:lang w:val="en-US" w:eastAsia="zh-CN" w:bidi="ar-SA"/>
-        </w:rPr>
-        <w:t>GetCharacterMovement()-&gt;MaxWalkSpeed = WalkSpeed;</w:t>
-      </w:r>
-    </w:p>
-    <w:p>
-      <w:pPr>
-        <w:widowControl w:val="0"/>
-        <w:ind w:left="0" w:leftChars="0" w:firstLine="420" w:firstLineChars="200"/>
-        <w:jc w:val="both"/>
-        <w:rPr>
-          <w:rFonts w:hint="eastAsia" w:asciiTheme="minorHAnsi" w:hAnsiTheme="minorHAnsi" w:eastAsiaTheme="minorEastAsia" w:cstheme="minorBidi"/>
-          <w:kern w:val="2"/>
-          <w:sz w:val="21"/>
-          <w:szCs w:val="24"/>
-          <w:lang w:val="en-US" w:eastAsia="zh-CN" w:bidi="ar-SA"/>
-        </w:rPr>
-      </w:pPr>
-      <w:r>
-        <w:rPr>
-          <w:rFonts w:hint="eastAsia" w:asciiTheme="minorHAnsi" w:hAnsiTheme="minorHAnsi" w:eastAsiaTheme="minorEastAsia" w:cstheme="minorBidi"/>
-          <w:kern w:val="2"/>
-          <w:sz w:val="21"/>
-          <w:szCs w:val="24"/>
-          <w:lang w:val="en-US" w:eastAsia="zh-CN" w:bidi="ar-SA"/>
-        </w:rPr>
-        <w:t>开火如果是“按住连发”，也建议分开始和停止：</w:t>
-      </w:r>
-    </w:p>
-    <w:p>
-      <w:pPr>
-        <w:widowControl w:val="0"/>
-        <w:ind w:left="0" w:leftChars="0" w:firstLine="420" w:firstLineChars="200"/>
-        <w:jc w:val="both"/>
-        <w:rPr>
-          <w:rFonts w:hint="eastAsia" w:asciiTheme="minorHAnsi" w:hAnsiTheme="minorHAnsi" w:eastAsiaTheme="minorEastAsia" w:cstheme="minorBidi"/>
-          <w:kern w:val="2"/>
-          <w:sz w:val="21"/>
-          <w:szCs w:val="24"/>
-          <w:lang w:val="en-US" w:eastAsia="zh-CN" w:bidi="ar-SA"/>
-        </w:rPr>
-      </w:pPr>
-      <w:r>
-        <w:rPr>
-          <w:rFonts w:hint="eastAsia" w:asciiTheme="minorHAnsi" w:hAnsiTheme="minorHAnsi" w:eastAsiaTheme="minorEastAsia" w:cstheme="minorBidi"/>
-          <w:kern w:val="2"/>
-          <w:sz w:val="21"/>
-          <w:szCs w:val="24"/>
-          <w:lang w:val="en-US" w:eastAsia="zh-CN" w:bidi="ar-SA"/>
-        </w:rPr>
-        <w:t>EnhancedInputComponent-&gt;BindAction(Input_Fire, ETriggerEvent::Started, this, &amp;ASCharacter::StartFire);</w:t>
-      </w:r>
-    </w:p>
-    <w:p>
-      <w:pPr>
-        <w:widowControl w:val="0"/>
-        <w:ind w:left="0" w:leftChars="0" w:firstLine="420" w:firstLineChars="200"/>
-        <w:jc w:val="both"/>
-        <w:rPr>
-          <w:rFonts w:hint="eastAsia" w:asciiTheme="minorHAnsi" w:hAnsiTheme="minorHAnsi" w:eastAsiaTheme="minorEastAsia" w:cstheme="minorBidi"/>
-          <w:kern w:val="2"/>
-          <w:sz w:val="21"/>
-          <w:szCs w:val="24"/>
-          <w:lang w:val="en-US" w:eastAsia="zh-CN" w:bidi="ar-SA"/>
-        </w:rPr>
-      </w:pPr>
-      <w:r>
-        <w:rPr>
-          <w:rFonts w:hint="eastAsia" w:asciiTheme="minorHAnsi" w:hAnsiTheme="minorHAnsi" w:eastAsiaTheme="minorEastAsia" w:cstheme="minorBidi"/>
-          <w:kern w:val="2"/>
-          <w:sz w:val="21"/>
-          <w:szCs w:val="24"/>
-          <w:lang w:val="en-US" w:eastAsia="zh-CN" w:bidi="ar-SA"/>
-        </w:rPr>
-        <w:t>EnhancedInputComponent-&gt;BindAction(Input_Fire, ETriggerEvent::Completed, this, &amp;ASCharacter::StopFire);</w:t>
-      </w:r>
-    </w:p>
-    <w:p>
-      <w:pPr>
-        <w:widowControl w:val="0"/>
-        <w:ind w:left="0" w:leftChars="0" w:firstLine="420" w:firstLineChars="200"/>
-        <w:jc w:val="both"/>
-        <w:rPr>
-          <w:rFonts w:hint="eastAsia" w:asciiTheme="minorHAnsi" w:hAnsiTheme="minorHAnsi" w:eastAsiaTheme="minorEastAsia" w:cstheme="minorBidi"/>
-          <w:kern w:val="2"/>
-          <w:sz w:val="21"/>
-          <w:szCs w:val="24"/>
-          <w:lang w:val="en-US" w:eastAsia="zh-CN" w:bidi="ar-SA"/>
-        </w:rPr>
-      </w:pPr>
-      <w:r>
-        <w:rPr>
-          <w:rFonts w:hint="eastAsia" w:asciiTheme="minorHAnsi" w:hAnsiTheme="minorHAnsi" w:eastAsiaTheme="minorEastAsia" w:cstheme="minorBidi"/>
-          <w:kern w:val="2"/>
-          <w:sz w:val="21"/>
-          <w:szCs w:val="24"/>
-          <w:lang w:val="en-US" w:eastAsia="zh-CN" w:bidi="ar-SA"/>
-        </w:rPr>
-        <w:t>然后 StartFire() 里开启定时器，按射速调用 Fire()；StopFire() 里清定时器。</w:t>
-      </w:r>
-    </w:p>
-    <w:p>
-      <w:pPr>
-        <w:widowControl w:val="0"/>
-        <w:ind w:left="0" w:leftChars="0" w:firstLine="420" w:firstLineChars="200"/>
-        <w:jc w:val="both"/>
-        <w:rPr>
-          <w:rFonts w:hint="eastAsia" w:asciiTheme="minorHAnsi" w:hAnsiTheme="minorHAnsi" w:eastAsiaTheme="minorEastAsia" w:cstheme="minorBidi"/>
-          <w:kern w:val="2"/>
-          <w:sz w:val="21"/>
-          <w:szCs w:val="24"/>
-          <w:lang w:val="en-US" w:eastAsia="zh-CN" w:bidi="ar-SA"/>
-        </w:rPr>
-      </w:pPr>
-      <w:r>
-        <w:rPr>
-          <w:rFonts w:hint="eastAsia" w:asciiTheme="minorHAnsi" w:hAnsiTheme="minorHAnsi" w:eastAsiaTheme="minorEastAsia" w:cstheme="minorBidi"/>
-          <w:kern w:val="2"/>
-          <w:sz w:val="21"/>
-          <w:szCs w:val="24"/>
-          <w:lang w:val="en-US" w:eastAsia="zh-CN" w:bidi="ar-SA"/>
-        </w:rPr>
-        <w:t>如果你现在这样写：</w:t>
-      </w:r>
-    </w:p>
-    <w:p>
-      <w:pPr>
-        <w:widowControl w:val="0"/>
-        <w:ind w:left="0" w:leftChars="0" w:firstLine="420" w:firstLineChars="200"/>
-        <w:jc w:val="both"/>
-        <w:rPr>
-          <w:rFonts w:hint="eastAsia" w:asciiTheme="minorHAnsi" w:hAnsiTheme="minorHAnsi" w:eastAsiaTheme="minorEastAsia" w:cstheme="minorBidi"/>
-          <w:kern w:val="2"/>
-          <w:sz w:val="21"/>
-          <w:szCs w:val="24"/>
-          <w:lang w:val="en-US" w:eastAsia="zh-CN" w:bidi="ar-SA"/>
-        </w:rPr>
-      </w:pPr>
-      <w:r>
-        <w:rPr>
-          <w:rFonts w:hint="eastAsia" w:asciiTheme="minorHAnsi" w:hAnsiTheme="minorHAnsi" w:eastAsiaTheme="minorEastAsia" w:cstheme="minorBidi"/>
-          <w:kern w:val="2"/>
-          <w:sz w:val="21"/>
-          <w:szCs w:val="24"/>
-          <w:lang w:val="en-US" w:eastAsia="zh-CN" w:bidi="ar-SA"/>
-        </w:rPr>
-        <w:t>EnhancedInputComponent-&gt;BindAction(Input_Fire, ETriggerEvent::Triggered, this, &amp;ASCharacter::Fire);</w:t>
-      </w:r>
-    </w:p>
-    <w:p>
-      <w:pPr>
-        <w:widowControl w:val="0"/>
-        <w:ind w:left="0" w:leftChars="0" w:firstLine="420" w:firstLineChars="200"/>
-        <w:jc w:val="both"/>
-        <w:rPr>
-          <w:rFonts w:hint="eastAsia" w:asciiTheme="minorHAnsi" w:hAnsiTheme="minorHAnsi" w:eastAsiaTheme="minorEastAsia" w:cstheme="minorBidi"/>
-          <w:kern w:val="2"/>
-          <w:sz w:val="21"/>
-          <w:szCs w:val="24"/>
-          <w:lang w:val="en-US" w:eastAsia="zh-CN" w:bidi="ar-SA"/>
-        </w:rPr>
-      </w:pPr>
-      <w:r>
-        <w:rPr>
-          <w:rFonts w:hint="eastAsia" w:asciiTheme="minorHAnsi" w:hAnsiTheme="minorHAnsi" w:eastAsiaTheme="minorEastAsia" w:cstheme="minorBidi"/>
-          <w:kern w:val="2"/>
-          <w:sz w:val="21"/>
-          <w:szCs w:val="24"/>
-          <w:lang w:val="en-US" w:eastAsia="zh-CN" w:bidi="ar-SA"/>
-        </w:rPr>
-        <w:t>在普通按住输入下，Fire() 可能会每帧调用一次，射速会跟帧率绑定，不太适合枪械。半自动用 Started，全自动用 Started +</w:t>
-      </w:r>
-    </w:p>
-    <w:p>
-      <w:pPr>
-        <w:widowControl w:val="0"/>
-        <w:ind w:left="0" w:leftChars="0" w:firstLine="420" w:firstLineChars="200"/>
-        <w:jc w:val="both"/>
-        <w:rPr>
-          <w:rFonts w:hint="eastAsia" w:asciiTheme="minorHAnsi" w:hAnsiTheme="minorHAnsi" w:eastAsiaTheme="minorEastAsia" w:cstheme="minorBidi"/>
-          <w:kern w:val="2"/>
-          <w:sz w:val="21"/>
-          <w:szCs w:val="24"/>
-          <w:lang w:val="en-US" w:eastAsia="zh-CN" w:bidi="ar-SA"/>
-        </w:rPr>
-      </w:pPr>
-      <w:r>
-        <w:rPr>
-          <w:rFonts w:hint="eastAsia" w:asciiTheme="minorHAnsi" w:hAnsiTheme="minorHAnsi" w:eastAsiaTheme="minorEastAsia" w:cstheme="minorBidi"/>
-          <w:kern w:val="2"/>
-          <w:sz w:val="21"/>
-          <w:szCs w:val="24"/>
-          <w:lang w:val="en-US" w:eastAsia="zh-CN" w:bidi="ar-SA"/>
-        </w:rPr>
-        <w:t>Timer + Completed 更稳。</w:t>
-      </w:r>
-    </w:p>
-    <w:p>
-      <w:pPr>
-        <w:widowControl w:val="0"/>
-        <w:ind w:left="0" w:leftChars="0" w:firstLine="420" w:firstLineChars="200"/>
-        <w:jc w:val="both"/>
-        <w:rPr>
-          <w:rFonts w:hint="eastAsia" w:asciiTheme="minorHAnsi" w:hAnsiTheme="minorHAnsi" w:eastAsiaTheme="minorEastAsia" w:cstheme="minorBidi"/>
-          <w:kern w:val="2"/>
-          <w:sz w:val="21"/>
-          <w:szCs w:val="24"/>
-          <w:lang w:val="en-US" w:eastAsia="zh-CN" w:bidi="ar-SA"/>
-        </w:rPr>
-      </w:pPr>
-      <w:r>
-        <w:rPr>
-          <w:rFonts w:hint="eastAsia" w:asciiTheme="minorHAnsi" w:hAnsiTheme="minorHAnsi" w:eastAsiaTheme="minorEastAsia" w:cstheme="minorBidi"/>
-          <w:kern w:val="2"/>
-          <w:sz w:val="21"/>
-          <w:szCs w:val="24"/>
-          <w:lang w:val="en-US" w:eastAsia="zh-CN" w:bidi="ar-SA"/>
-        </w:rPr>
-        <w:t>另外检查一下 Input_Fire / Input_Sprint 这个 Input Action 资产里有没有加 Pressed Trigger。如果加了，它就会更像“按下一次</w:t>
-      </w:r>
-    </w:p>
-    <w:p>
-      <w:pPr>
-        <w:widowControl w:val="0"/>
-        <w:ind w:left="0" w:leftChars="0" w:firstLine="420" w:firstLineChars="200"/>
-        <w:jc w:val="both"/>
-        <w:rPr>
-          <w:rFonts w:hint="eastAsia" w:asciiTheme="minorHAnsi" w:hAnsiTheme="minorHAnsi" w:eastAsiaTheme="minorEastAsia" w:cstheme="minorBidi"/>
-          <w:kern w:val="2"/>
-          <w:sz w:val="21"/>
-          <w:szCs w:val="24"/>
-          <w:lang w:val="en-US" w:eastAsia="zh-CN" w:bidi="ar-SA"/>
-        </w:rPr>
-      </w:pPr>
-      <w:r>
-        <w:rPr>
-          <w:rFonts w:hint="eastAsia" w:asciiTheme="minorHAnsi" w:hAnsiTheme="minorHAnsi" w:eastAsiaTheme="minorEastAsia" w:cstheme="minorBidi"/>
-          <w:kern w:val="2"/>
-          <w:sz w:val="21"/>
-          <w:szCs w:val="24"/>
-          <w:lang w:val="en-US" w:eastAsia="zh-CN" w:bidi="ar-SA"/>
-        </w:rPr>
-        <w:t>触发一次”。</w:t>
-      </w:r>
-    </w:p>
-    <w:p>
-      <w:pPr>
-        <w:widowControl w:val="0"/>
-        <w:numPr>
-          <w:ilvl w:val="0"/>
-          <w:numId w:val="0"/>
-        </w:numPr>
-        <w:tabs>
-          <w:tab w:val="left" w:pos="312"/>
-        </w:tabs>
-        <w:jc w:val="left"/>
-        <w:rPr>
-          <w:rFonts w:hint="default"/>
-          <w:lang w:val="en-US" w:eastAsia="zh-CN"/>
-        </w:rPr>
-      </w:pPr>
     </w:p>
     <w:p>
       <w:pPr>
@@ -869,9 +265,55 @@
         </w:rPr>
         <w:t>子弹没发射出去</w:t>
       </w:r>
+    </w:p>
+    <w:p>
+      <w:pPr>
+        <w:widowControl w:val="0"/>
+        <w:numPr>
+          <w:ilvl w:val="0"/>
+          <w:numId w:val="1"/>
+        </w:numPr>
+        <w:ind w:left="0" w:leftChars="0" w:firstLine="420" w:firstLineChars="200"/>
+        <w:jc w:val="left"/>
+        <w:rPr>
+          <w:rFonts w:hint="default"/>
+          <w:lang w:val="en-US" w:eastAsia="zh-CN"/>
+        </w:rPr>
+      </w:pPr>
+      <w:r>
+        <w:rPr>
+          <w:rFonts w:hint="eastAsia"/>
+          <w:lang w:val="en-US" w:eastAsia="zh-CN"/>
+        </w:rPr>
+        <w:t>如果客户端看不到这个弹道啥的，就检查这个fire里面的这个hasauthority</w:t>
+      </w:r>
+    </w:p>
+    <w:p>
+      <w:pPr>
+        <w:widowControl w:val="0"/>
+        <w:numPr>
+          <w:ilvl w:val="0"/>
+          <w:numId w:val="1"/>
+        </w:numPr>
+        <w:ind w:left="0" w:leftChars="0" w:firstLine="420" w:firstLineChars="200"/>
+        <w:jc w:val="left"/>
+        <w:rPr>
+          <w:rFonts w:hint="default"/>
+          <w:highlight w:val="yellow"/>
+          <w:lang w:val="en-US" w:eastAsia="zh-CN"/>
+        </w:rPr>
+      </w:pPr>
       <w:bookmarkStart w:id="0" w:name="_GoBack"/>
-      <w:bookmarkEnd w:id="0"/>
-    </w:p>
+      <w:r>
+        <w:rPr>
+          <w:rFonts w:hint="eastAsia"/>
+          <w:highlight w:val="yellow"/>
+          <w:lang w:val="en-US" w:eastAsia="zh-CN"/>
+        </w:rPr>
+        <w:t>在aim结束的一瞬间按shift，他会显示没有启动sprint这个action，但是已经进入了sprint这个状态，然后按下鼠标右键，fov会变，但是没有aim的anim</w:t>
+      </w:r>
+    </w:p>
+    <w:bookmarkEnd w:id="0"/>
     <w:sectPr>
       <w:pgSz w:w="11906" w:h="16838"/>
       <w:pgMar w:top="1440" w:right="1800" w:bottom="1440" w:left="1800" w:header="851" w:footer="992" w:gutter="0"/>

</xml_diff>

<commit_message>
remove the fire logic from FireAction to GunBase
</commit_message>
<xml_diff>
--- a/问题StellarFront.docx
+++ b/问题StellarFront.docx
@@ -1,6 +1,6 @@
 
 <file path=word/document.xml><?xml version="1.0" encoding="utf-8"?>
-<w:document xmlns:wpc="http://schemas.microsoft.com/office/word/2010/wordprocessingCanvas" xmlns:mc="http://schemas.openxmlformats.org/markup-compatibility/2006" xmlns:o="urn:schemas-microsoft-com:office:office" xmlns:r="http://schemas.openxmlformats.org/officeDocument/2006/relationships" xmlns:m="http://schemas.openxmlformats.org/officeDocument/2006/math" xmlns:v="urn:schemas-microsoft-com:vml" xmlns:wp14="http://schemas.microsoft.com/office/word/2010/wordprocessingDrawing" xmlns:wp="http://schemas.openxmlformats.org/drawingml/2006/wordprocessingDrawing" xmlns:w="http://schemas.openxmlformats.org/wordprocessingml/2006/main" xmlns:w14="http://schemas.microsoft.com/office/word/2010/wordml" xmlns:w10="urn:schemas-microsoft-com:office:word" xmlns:w15="http://schemas.microsoft.com/office/word/2012/wordml" xmlns:wpg="http://schemas.microsoft.com/office/word/2010/wordprocessingGroup" xmlns:wpi="http://schemas.microsoft.com/office/word/2010/wordprocessingInk" xmlns:wne="http://schemas.microsoft.com/office/word/2006/wordml" xmlns:wps="http://schemas.microsoft.com/office/word/2010/wordprocessingShape" xmlns:wpsCustomData="http://www.wps.cn/officeDocument/2013/wpsCustomData" mc:Ignorable="w14 w15 wp14">
+<w:document xmlns:wpc="http://schemas.microsoft.com/office/word/2010/wordprocessingCanvas" xmlns:cx="http://schemas.microsoft.com/office/drawing/2014/chartex" xmlns:cx1="http://schemas.microsoft.com/office/drawing/2015/9/8/chartex" xmlns:cx2="http://schemas.microsoft.com/office/drawing/2015/10/21/chartex" xmlns:cx3="http://schemas.microsoft.com/office/drawing/2016/5/9/chartex" xmlns:cx4="http://schemas.microsoft.com/office/drawing/2016/5/10/chartex" xmlns:cx5="http://schemas.microsoft.com/office/drawing/2016/5/11/chartex" xmlns:cx6="http://schemas.microsoft.com/office/drawing/2016/5/12/chartex" xmlns:cx7="http://schemas.microsoft.com/office/drawing/2016/5/13/chartex" xmlns:cx8="http://schemas.microsoft.com/office/drawing/2016/5/14/chartex" xmlns:mc="http://schemas.openxmlformats.org/markup-compatibility/2006" xmlns:o="urn:schemas-microsoft-com:office:office" xmlns:r="http://schemas.openxmlformats.org/officeDocument/2006/relationships" xmlns:m="http://schemas.openxmlformats.org/officeDocument/2006/math" xmlns:v="urn:schemas-microsoft-com:vml" xmlns:wp14="http://schemas.microsoft.com/office/word/2010/wordprocessingDrawing" xmlns:wp="http://schemas.openxmlformats.org/drawingml/2006/wordprocessingDrawing" xmlns:w="http://schemas.openxmlformats.org/wordprocessingml/2006/main" xmlns:w14="http://schemas.microsoft.com/office/word/2010/wordml" xmlns:w10="urn:schemas-microsoft-com:office:word" xmlns:w15="http://schemas.microsoft.com/office/word/2012/wordml" xmlns:wpg="http://schemas.microsoft.com/office/word/2010/wordprocessingGroup" xmlns:wpi="http://schemas.microsoft.com/office/word/2010/wordprocessingInk" xmlns:wne="http://schemas.microsoft.com/office/word/2006/wordml" xmlns:wps="http://schemas.microsoft.com/office/word/2010/wordprocessingShape" xmlns:wpsCustomData="http://www.wps.cn/officeDocument/2013/wpsCustomData" mc:Ignorable="w14 w15 wp14">
   <w:body>
     <w:p>
       <w:pPr>
@@ -382,6 +382,30 @@
           <w:lang w:val="en-US" w:eastAsia="zh-CN"/>
         </w:rPr>
         <w:t>里面，然后具体的操作函数写在abstract的WeaponBase里面</w:t>
+      </w:r>
+    </w:p>
+    <w:p>
+      <w:pPr>
+        <w:widowControl w:val="0"/>
+        <w:numPr>
+          <w:ilvl w:val="0"/>
+          <w:numId w:val="1"/>
+        </w:numPr>
+        <w:ind w:left="0" w:leftChars="0" w:firstLine="420" w:firstLineChars="200"/>
+        <w:jc w:val="both"/>
+        <w:rPr>
+          <w:rFonts w:hint="default"/>
+          <w:highlight w:val="none"/>
+          <w:lang w:val="en-US" w:eastAsia="zh-CN"/>
+        </w:rPr>
+      </w:pPr>
+      <w:r>
+        <w:rPr>
+          <w:rFonts w:hint="default"/>
+          <w:highlight w:val="none"/>
+          <w:lang w:val="en-US" w:eastAsia="zh-CN"/>
+        </w:rPr>
+        <w:t>when the character moves backward, the weapon animation is not synchronous with the character.</w:t>
       </w:r>
       <w:bookmarkStart w:id="0" w:name="_GoBack"/>
       <w:bookmarkEnd w:id="0"/>

</xml_diff>

<commit_message>
done with UI UpdateAmmo
</commit_message>
<xml_diff>
--- a/问题StellarFront.docx
+++ b/问题StellarFront.docx
@@ -307,11 +307,11 @@
       </w:pPr>
       <w:r>
         <w:rPr>
-          <w:rFonts w:hint="default"/>
+          <w:rFonts w:hint="eastAsia"/>
           <w:highlight w:val="none"/>
           <w:lang w:val="en-US" w:eastAsia="zh-CN"/>
         </w:rPr>
-        <w:t>when the character moves backward, the weapon animation is not synchronous with the character.</w:t>
+        <w:t>这个reload的montage的“rate scale”就是播放速度，到时候可以设置成gunbase里面的那个“换弹速度”</w:t>
       </w:r>
     </w:p>
     <w:p>
@@ -335,18 +335,82 @@
           <w:highlight w:val="none"/>
           <w:lang w:val="en-US" w:eastAsia="zh-CN"/>
         </w:rPr>
-        <w:t>这个reload的montage的“rate scale”就是播放速度，到时候可以设置成gunbase里面的那个“换弹速度</w:t>
+        <w:t>目前我设置的是sprint的时候不让fire，但是到时候可以设置成，sprint的</w:t>
+      </w:r>
+    </w:p>
+    <w:p>
+      <w:pPr>
+        <w:widowControl w:val="0"/>
+        <w:numPr>
+          <w:ilvl w:val="0"/>
+          <w:numId w:val="1"/>
+        </w:numPr>
+        <w:ind w:left="0" w:leftChars="0" w:firstLine="420" w:firstLineChars="200"/>
+        <w:jc w:val="both"/>
+        <w:rPr>
+          <w:rFonts w:hint="default"/>
+          <w:highlight w:val="none"/>
+          <w:lang w:val="en-US" w:eastAsia="zh-CN"/>
+        </w:rPr>
+      </w:pPr>
+      <w:r>
+        <w:rPr>
+          <w:rFonts w:hint="eastAsia"/>
+          <w:highlight w:val="none"/>
+          <w:lang w:val="en-US" w:eastAsia="zh-CN"/>
+        </w:rPr>
+        <w:t>每一个cube的physical material override我是没设置的，如果想要体现出来的话，是得每一个每一个去设置的。</w:t>
+      </w:r>
+    </w:p>
+    <w:p>
+      <w:pPr>
+        <w:widowControl w:val="0"/>
+        <w:numPr>
+          <w:ilvl w:val="0"/>
+          <w:numId w:val="1"/>
+        </w:numPr>
+        <w:ind w:left="0" w:leftChars="0" w:firstLine="420" w:firstLineChars="200"/>
+        <w:jc w:val="both"/>
+        <w:rPr>
+          <w:rFonts w:hint="default"/>
+          <w:highlight w:val="none"/>
+          <w:lang w:val="en-US" w:eastAsia="zh-CN"/>
+        </w:rPr>
+      </w:pPr>
+      <w:r>
+        <w:rPr>
+          <w:rFonts w:hint="eastAsia"/>
+          <w:highlight w:val="none"/>
+          <w:lang w:val="en-US" w:eastAsia="zh-CN"/>
+        </w:rPr>
+        <w:t>如果击打特效的onhitsound每个声音大小要调试的话，可以多在这个onhitflashsound类里面多加一个float volume的大小</w:t>
+      </w:r>
+    </w:p>
+    <w:p>
+      <w:pPr>
+        <w:widowControl w:val="0"/>
+        <w:numPr>
+          <w:ilvl w:val="0"/>
+          <w:numId w:val="1"/>
+        </w:numPr>
+        <w:ind w:left="0" w:leftChars="0" w:firstLine="420" w:firstLineChars="200"/>
+        <w:jc w:val="both"/>
+        <w:rPr>
+          <w:rFonts w:hint="default"/>
+          <w:highlight w:val="none"/>
+          <w:lang w:val="en-US" w:eastAsia="zh-CN"/>
+        </w:rPr>
+      </w:pPr>
+      <w:r>
+        <w:rPr>
+          <w:rFonts w:hint="eastAsia"/>
+          <w:highlight w:val="none"/>
+          <w:lang w:val="en-US" w:eastAsia="zh-CN"/>
+        </w:rPr>
+        <w:t>弹孔生成在我的casing actor上面了</w:t>
       </w:r>
       <w:bookmarkStart w:id="0" w:name="_GoBack"/>
       <w:bookmarkEnd w:id="0"/>
-      <w:r>
-        <w:rPr>
-          <w:rFonts w:hint="eastAsia"/>
-          <w:highlight w:val="none"/>
-          <w:lang w:val="en-US" w:eastAsia="zh-CN"/>
-        </w:rPr>
-        <w:t>”</w:t>
-      </w:r>
     </w:p>
     <w:sectPr>
       <w:pgSz w:w="11906" w:h="16838"/>

</xml_diff>

<commit_message>
all basic sets done.Begin with GameMode
</commit_message>
<xml_diff>
--- a/问题StellarFront.docx
+++ b/问题StellarFront.docx
@@ -408,6 +408,30 @@
           <w:lang w:val="en-US" w:eastAsia="zh-CN"/>
         </w:rPr>
         <w:t>弹孔生成在我的casing actor上面了</w:t>
+      </w:r>
+    </w:p>
+    <w:p>
+      <w:pPr>
+        <w:widowControl w:val="0"/>
+        <w:numPr>
+          <w:ilvl w:val="0"/>
+          <w:numId w:val="1"/>
+        </w:numPr>
+        <w:ind w:left="0" w:leftChars="0" w:firstLine="420" w:firstLineChars="200"/>
+        <w:jc w:val="both"/>
+        <w:rPr>
+          <w:rFonts w:hint="default"/>
+          <w:highlight w:val="none"/>
+          <w:lang w:val="en-US" w:eastAsia="zh-CN"/>
+        </w:rPr>
+      </w:pPr>
+      <w:r>
+        <w:rPr>
+          <w:rFonts w:hint="eastAsia"/>
+          <w:highlight w:val="none"/>
+          <w:lang w:val="en-US" w:eastAsia="zh-CN"/>
+        </w:rPr>
+        <w:t>ui还可以绑定更多。比如武器的icon我已经设计好接口了，还有weapon name也是</w:t>
       </w:r>
       <w:bookmarkStart w:id="0" w:name="_GoBack"/>
       <w:bookmarkEnd w:id="0"/>

</xml_diff>

<commit_message>
finish with AssignTeam logic & Projectile Replicate Movement
</commit_message>
<xml_diff>
--- a/问题StellarFront.docx
+++ b/问题StellarFront.docx
@@ -432,6 +432,38 @@
           <w:lang w:val="en-US" w:eastAsia="zh-CN"/>
         </w:rPr>
         <w:t>ui还可以绑定更多。比如武器的icon我已经设计好接口了，还有weapon name也是</w:t>
+      </w:r>
+    </w:p>
+    <w:p>
+      <w:pPr>
+        <w:widowControl w:val="0"/>
+        <w:numPr>
+          <w:ilvl w:val="0"/>
+          <w:numId w:val="1"/>
+        </w:numPr>
+        <w:ind w:left="0" w:leftChars="0" w:firstLine="420" w:firstLineChars="200"/>
+        <w:jc w:val="both"/>
+        <w:rPr>
+          <w:rFonts w:hint="default"/>
+          <w:highlight w:val="none"/>
+          <w:lang w:val="en-US" w:eastAsia="zh-CN"/>
+        </w:rPr>
+      </w:pPr>
+      <w:r>
+        <w:rPr>
+          <w:rFonts w:hint="default"/>
+          <w:highlight w:val="none"/>
+          <w:lang w:val="en-US" w:eastAsia="zh-CN"/>
+        </w:rPr>
+        <w:t>net</w:t>
+      </w:r>
+      <w:r>
+        <w:rPr>
+          <w:rFonts w:hint="eastAsia"/>
+          <w:highlight w:val="none"/>
+          <w:lang w:val="en-US" w:eastAsia="zh-CN"/>
+        </w:rPr>
+        <w:t>的所有检测我都没做，replicate还有match的阶段一个都没检测过，记得测试一下</w:t>
       </w:r>
       <w:bookmarkStart w:id="0" w:name="_GoBack"/>
       <w:bookmarkEnd w:id="0"/>

</xml_diff>

<commit_message>
Respawn Player logic done & Optimize the PlayerStart contribution
</commit_message>
<xml_diff>
--- a/问题StellarFront.docx
+++ b/问题StellarFront.docx
@@ -465,8 +465,112 @@
         </w:rPr>
         <w:t>的所有检测我都没做，replicate还有match的阶段一个都没检测过，记得测试一下</w:t>
       </w:r>
+    </w:p>
+    <w:p>
+      <w:pPr>
+        <w:widowControl w:val="0"/>
+        <w:numPr>
+          <w:ilvl w:val="0"/>
+          <w:numId w:val="1"/>
+        </w:numPr>
+        <w:ind w:left="0" w:leftChars="0" w:firstLine="420" w:firstLineChars="200"/>
+        <w:jc w:val="both"/>
+        <w:rPr>
+          <w:rFonts w:hint="default"/>
+          <w:highlight w:val="none"/>
+          <w:lang w:val="en-US" w:eastAsia="zh-CN"/>
+        </w:rPr>
+      </w:pPr>
+      <w:r>
+        <w:rPr>
+          <w:rFonts w:hint="eastAsia"/>
+          <w:highlight w:val="none"/>
+          <w:lang w:val="en-US" w:eastAsia="zh-CN"/>
+        </w:rPr>
+        <w:t>ui重叠了</w:t>
+      </w:r>
+    </w:p>
+    <w:p>
+      <w:pPr>
+        <w:widowControl w:val="0"/>
+        <w:numPr>
+          <w:ilvl w:val="0"/>
+          <w:numId w:val="1"/>
+        </w:numPr>
+        <w:ind w:left="0" w:leftChars="0" w:firstLine="420" w:firstLineChars="200"/>
+        <w:jc w:val="both"/>
+        <w:rPr>
+          <w:rFonts w:hint="default"/>
+          <w:highlight w:val="none"/>
+          <w:lang w:val="en-US" w:eastAsia="zh-CN"/>
+        </w:rPr>
+      </w:pPr>
+      <w:r>
+        <w:rPr>
+          <w:rFonts w:hint="eastAsia"/>
+          <w:highlight w:val="none"/>
+          <w:lang w:val="en-US" w:eastAsia="zh-CN"/>
+        </w:rPr>
+        <w:t>子弹啥的没rep</w:t>
+      </w:r>
+    </w:p>
+    <w:p>
+      <w:pPr>
+        <w:widowControl w:val="0"/>
+        <w:numPr>
+          <w:ilvl w:val="0"/>
+          <w:numId w:val="1"/>
+        </w:numPr>
+        <w:ind w:left="0" w:leftChars="0" w:firstLine="420" w:firstLineChars="200"/>
+        <w:jc w:val="both"/>
+        <w:rPr>
+          <w:rFonts w:hint="default"/>
+          <w:highlight w:val="none"/>
+          <w:lang w:val="en-US" w:eastAsia="zh-CN"/>
+        </w:rPr>
+      </w:pPr>
+      <w:r>
+        <w:rPr>
+          <w:rFonts w:hint="eastAsia"/>
+          <w:highlight w:val="none"/>
+          <w:lang w:val="en-US" w:eastAsia="zh-CN"/>
+        </w:rPr>
+        <w:t>savegame没做</w:t>
+      </w:r>
+    </w:p>
+    <w:p>
+      <w:pPr>
+        <w:widowControl w:val="0"/>
+        <w:numPr>
+          <w:ilvl w:val="0"/>
+          <w:numId w:val="1"/>
+        </w:numPr>
+        <w:ind w:left="0" w:leftChars="0" w:firstLine="420" w:firstLineChars="200"/>
+        <w:jc w:val="both"/>
+        <w:rPr>
+          <w:rFonts w:hint="default"/>
+          <w:highlight w:val="none"/>
+          <w:lang w:val="en-US" w:eastAsia="zh-CN"/>
+        </w:rPr>
+      </w:pPr>
+      <w:r>
+        <w:rPr>
+          <w:rFonts w:hint="eastAsia"/>
+          <w:highlight w:val="none"/>
+          <w:lang w:val="en-US" w:eastAsia="zh-CN"/>
+        </w:rPr>
+        <w:t xml:space="preserve">在handlematchended里面没有检测loggamemode里面的那个respawn </w:t>
+      </w:r>
       <w:bookmarkStart w:id="0" w:name="_GoBack"/>
       <w:bookmarkEnd w:id="0"/>
+      <w:r>
+        <w:rPr>
+          <w:rFonts w:hint="eastAsia"/>
+          <w:highlight w:val="none"/>
+          <w:lang w:val="en-US" w:eastAsia="zh-CN"/>
+        </w:rPr>
+        <w:t>failed</w:t>
+      </w:r>
     </w:p>
     <w:sectPr>
       <w:pgSz w:w="11906" w:h="16838"/>

</xml_diff>

<commit_message>
finished UI Ammo Update & Bind problem
</commit_message>
<xml_diff>
--- a/问题StellarFront.docx
+++ b/问题StellarFront.docx
@@ -559,18 +559,331 @@
           <w:highlight w:val="none"/>
           <w:lang w:val="en-US" w:eastAsia="zh-CN"/>
         </w:rPr>
-        <w:t xml:space="preserve">在handlematchended里面没有检测loggamemode里面的那个respawn </w:t>
+        <w:t>在handlematchended里面没有检测loggamemode里面的那个respawn failed</w:t>
+      </w:r>
+    </w:p>
+    <w:p>
+      <w:pPr>
+        <w:widowControl w:val="0"/>
+        <w:numPr>
+          <w:ilvl w:val="0"/>
+          <w:numId w:val="1"/>
+        </w:numPr>
+        <w:ind w:left="0" w:leftChars="0" w:firstLine="420" w:firstLineChars="200"/>
+        <w:jc w:val="both"/>
+        <w:rPr>
+          <w:rFonts w:hint="default"/>
+          <w:highlight w:val="none"/>
+          <w:lang w:val="en-US" w:eastAsia="zh-CN"/>
+        </w:rPr>
+      </w:pPr>
+      <w:r>
+        <w:rPr>
+          <w:rFonts w:hint="default"/>
+          <w:highlight w:val="none"/>
+          <w:lang w:val="en-US" w:eastAsia="zh-CN"/>
+        </w:rPr>
+        <w:t xml:space="preserve">3p arm montage </w:t>
+      </w:r>
+      <w:r>
+        <w:rPr>
+          <w:rFonts w:hint="eastAsia"/>
+          <w:highlight w:val="none"/>
+          <w:lang w:val="en-US" w:eastAsia="zh-CN"/>
+        </w:rPr>
+        <w:t>是要做的和gun一样，所有能看见角色的client都应该rep，是Net</w:t>
+      </w:r>
+      <w:r>
+        <w:rPr>
+          <w:rFonts w:hint="default"/>
+          <w:highlight w:val="none"/>
+          <w:lang w:val="en-US" w:eastAsia="zh-CN"/>
+        </w:rPr>
+        <w:t>R</w:t>
+      </w:r>
+      <w:r>
+        <w:rPr>
+          <w:rFonts w:hint="eastAsia"/>
+          <w:highlight w:val="none"/>
+          <w:lang w:val="en-US" w:eastAsia="zh-CN"/>
+        </w:rPr>
+        <w:t>elevancy</w:t>
+      </w:r>
+      <w:r>
+        <w:rPr>
+          <w:rFonts w:hint="default"/>
+          <w:highlight w:val="none"/>
+          <w:lang w:val="en-US" w:eastAsia="zh-CN"/>
+        </w:rPr>
+        <w:t>O</w:t>
+      </w:r>
+      <w:r>
+        <w:rPr>
+          <w:rFonts w:hint="eastAsia"/>
+          <w:highlight w:val="none"/>
+          <w:lang w:val="en-US" w:eastAsia="zh-CN"/>
+        </w:rPr>
+        <w:t>nly</w:t>
+      </w:r>
+    </w:p>
+    <w:p>
+      <w:pPr>
+        <w:widowControl w:val="0"/>
+        <w:ind w:left="0" w:leftChars="0" w:firstLine="420" w:firstLineChars="200"/>
+        <w:jc w:val="both"/>
+        <w:rPr>
+          <w:rFonts w:hint="default" w:asciiTheme="minorHAnsi" w:hAnsiTheme="minorHAnsi" w:eastAsiaTheme="minorEastAsia" w:cstheme="minorBidi"/>
+          <w:b/>
+          <w:kern w:val="2"/>
+          <w:sz w:val="21"/>
+          <w:szCs w:val="24"/>
+          <w:highlight w:val="none"/>
+          <w:lang w:val="en-US" w:eastAsia="zh-CN" w:bidi="ar-SA"/>
+        </w:rPr>
+      </w:pPr>
+      <w:r>
+        <w:rPr>
+          <w:rFonts w:hint="default" w:asciiTheme="minorHAnsi" w:hAnsiTheme="minorHAnsi" w:eastAsiaTheme="minorEastAsia" w:cstheme="minorBidi"/>
+          <w:b/>
+          <w:kern w:val="2"/>
+          <w:sz w:val="21"/>
+          <w:szCs w:val="24"/>
+          <w:highlight w:val="none"/>
+          <w:lang w:val="en-US" w:eastAsia="zh-CN" w:bidi="ar-SA"/>
+        </w:rPr>
+        <w:t>25.Dedicated Server 风险</w:t>
+      </w:r>
+    </w:p>
+    <w:p>
+      <w:pPr>
+        <w:widowControl w:val="0"/>
+        <w:ind w:left="0" w:leftChars="0" w:firstLine="420" w:firstLineChars="200"/>
+        <w:jc w:val="both"/>
+        <w:rPr>
+          <w:rFonts w:hint="default" w:asciiTheme="minorHAnsi" w:hAnsiTheme="minorHAnsi" w:eastAsiaTheme="minorEastAsia" w:cstheme="minorBidi"/>
+          <w:kern w:val="2"/>
+          <w:sz w:val="21"/>
+          <w:szCs w:val="24"/>
+          <w:highlight w:val="none"/>
+          <w:lang w:val="en-US" w:eastAsia="zh-CN" w:bidi="ar-SA"/>
+        </w:rPr>
+      </w:pPr>
+      <w:r>
+        <w:rPr>
+          <w:rFonts w:hint="default" w:asciiTheme="minorHAnsi" w:hAnsiTheme="minorHAnsi" w:eastAsiaTheme="minorEastAsia" w:cstheme="minorBidi"/>
+          <w:kern w:val="2"/>
+          <w:sz w:val="21"/>
+          <w:szCs w:val="24"/>
+          <w:highlight w:val="none"/>
+          <w:lang w:val="en-US" w:eastAsia="zh-CN" w:bidi="ar-SA"/>
+        </w:rPr>
+        <w:t>Gameplay 弹药提交长期不应该依赖 Montage Notify，因为 Dedicated Server 的 Mesh 动画 Tick 配置可能导致 Notify 不执行。</w:t>
+      </w:r>
+    </w:p>
+    <w:p>
+      <w:pPr>
+        <w:widowControl w:val="0"/>
+        <w:ind w:left="0" w:leftChars="0" w:firstLine="420" w:firstLineChars="200"/>
+        <w:jc w:val="both"/>
+        <w:rPr>
+          <w:rFonts w:hint="default" w:asciiTheme="minorHAnsi" w:hAnsiTheme="minorHAnsi" w:eastAsiaTheme="minorEastAsia" w:cstheme="minorBidi"/>
+          <w:kern w:val="2"/>
+          <w:sz w:val="21"/>
+          <w:szCs w:val="24"/>
+          <w:highlight w:val="none"/>
+          <w:lang w:val="en-US" w:eastAsia="zh-CN" w:bidi="ar-SA"/>
+        </w:rPr>
+      </w:pPr>
+      <w:r>
+        <w:rPr>
+          <w:rFonts w:hint="default" w:asciiTheme="minorHAnsi" w:hAnsiTheme="minorHAnsi" w:eastAsiaTheme="minorEastAsia" w:cstheme="minorBidi"/>
+          <w:kern w:val="2"/>
+          <w:sz w:val="21"/>
+          <w:szCs w:val="24"/>
+          <w:highlight w:val="none"/>
+          <w:lang w:val="en-US" w:eastAsia="zh-CN" w:bidi="ar-SA"/>
+        </w:rPr>
+        <w:t>当前目标是 2-player Listen Server，可以先保留 Notify。</w:t>
+      </w:r>
+    </w:p>
+    <w:p>
+      <w:pPr>
+        <w:widowControl w:val="0"/>
+        <w:ind w:left="0" w:leftChars="0" w:firstLine="420" w:firstLineChars="200"/>
+        <w:jc w:val="both"/>
+        <w:rPr>
+          <w:rFonts w:hint="default" w:asciiTheme="minorHAnsi" w:hAnsiTheme="minorHAnsi" w:eastAsiaTheme="minorEastAsia" w:cstheme="minorBidi"/>
+          <w:kern w:val="2"/>
+          <w:sz w:val="21"/>
+          <w:szCs w:val="24"/>
+          <w:highlight w:val="none"/>
+          <w:lang w:val="en-US" w:eastAsia="zh-CN" w:bidi="ar-SA"/>
+        </w:rPr>
+      </w:pPr>
+      <w:r>
+        <w:rPr>
+          <w:rFonts w:hint="default" w:asciiTheme="minorHAnsi" w:hAnsiTheme="minorHAnsi" w:eastAsiaTheme="minorEastAsia" w:cstheme="minorBidi"/>
+          <w:kern w:val="2"/>
+          <w:sz w:val="21"/>
+          <w:szCs w:val="24"/>
+          <w:highlight w:val="none"/>
+          <w:lang w:val="en-US" w:eastAsia="zh-CN" w:bidi="ar-SA"/>
+        </w:rPr>
+        <w:t>如果以后切 Dedicated Server，应增加：</w:t>
+      </w:r>
+    </w:p>
+    <w:p>
+      <w:pPr>
+        <w:widowControl w:val="0"/>
+        <w:tabs>
+          <w:tab w:val="left" w:pos="916"/>
+          <w:tab w:val="left" w:pos="1832"/>
+          <w:tab w:val="left" w:pos="2748"/>
+          <w:tab w:val="left" w:pos="3664"/>
+          <w:tab w:val="left" w:pos="4580"/>
+          <w:tab w:val="left" w:pos="5496"/>
+          <w:tab w:val="left" w:pos="6412"/>
+          <w:tab w:val="left" w:pos="7328"/>
+          <w:tab w:val="left" w:pos="8244"/>
+          <w:tab w:val="left" w:pos="9160"/>
+          <w:tab w:val="left" w:pos="10076"/>
+          <w:tab w:val="left" w:pos="10992"/>
+          <w:tab w:val="left" w:pos="11908"/>
+          <w:tab w:val="left" w:pos="12824"/>
+          <w:tab w:val="left" w:pos="13740"/>
+          <w:tab w:val="left" w:pos="14656"/>
+        </w:tabs>
+        <w:ind w:left="0" w:leftChars="0" w:firstLine="420" w:firstLineChars="200"/>
+        <w:jc w:val="both"/>
+        <w:rPr>
+          <w:rFonts w:hint="default" w:asciiTheme="minorHAnsi" w:hAnsiTheme="minorHAnsi" w:eastAsiaTheme="minorEastAsia" w:cstheme="minorBidi"/>
+          <w:kern w:val="2"/>
+          <w:sz w:val="21"/>
+          <w:szCs w:val="24"/>
+          <w:highlight w:val="none"/>
+          <w:lang w:val="en-US" w:eastAsia="zh-CN" w:bidi="ar-SA"/>
+        </w:rPr>
+      </w:pPr>
+      <w:r>
+        <w:rPr>
+          <w:rFonts w:hint="default" w:asciiTheme="minorHAnsi" w:hAnsiTheme="minorHAnsi" w:eastAsiaTheme="minorEastAsia" w:cstheme="minorBidi"/>
+          <w:kern w:val="2"/>
+          <w:sz w:val="21"/>
+          <w:szCs w:val="24"/>
+          <w:highlight w:val="none"/>
+          <w:lang w:val="en-US" w:eastAsia="zh-CN" w:bidi="ar-SA"/>
+        </w:rPr>
+        <w:t>UPROPERTY(EditDefaultsOnly, Category="Reload")</w:t>
+      </w:r>
+    </w:p>
+    <w:p>
+      <w:pPr>
+        <w:widowControl w:val="0"/>
+        <w:tabs>
+          <w:tab w:val="left" w:pos="916"/>
+          <w:tab w:val="left" w:pos="1832"/>
+          <w:tab w:val="left" w:pos="2748"/>
+          <w:tab w:val="left" w:pos="3664"/>
+          <w:tab w:val="left" w:pos="4580"/>
+          <w:tab w:val="left" w:pos="5496"/>
+          <w:tab w:val="left" w:pos="6412"/>
+          <w:tab w:val="left" w:pos="7328"/>
+          <w:tab w:val="left" w:pos="8244"/>
+          <w:tab w:val="left" w:pos="9160"/>
+          <w:tab w:val="left" w:pos="10076"/>
+          <w:tab w:val="left" w:pos="10992"/>
+          <w:tab w:val="left" w:pos="11908"/>
+          <w:tab w:val="left" w:pos="12824"/>
+          <w:tab w:val="left" w:pos="13740"/>
+          <w:tab w:val="left" w:pos="14656"/>
+        </w:tabs>
+        <w:ind w:left="0" w:leftChars="0" w:firstLine="420" w:firstLineChars="200"/>
+        <w:jc w:val="both"/>
+        <w:rPr>
+          <w:rFonts w:hint="default" w:asciiTheme="minorHAnsi" w:hAnsiTheme="minorHAnsi" w:eastAsiaTheme="minorEastAsia" w:cstheme="minorBidi"/>
+          <w:kern w:val="2"/>
+          <w:sz w:val="21"/>
+          <w:szCs w:val="24"/>
+          <w:highlight w:val="none"/>
+          <w:lang w:val="en-US" w:eastAsia="zh-CN" w:bidi="ar-SA"/>
+        </w:rPr>
+      </w:pPr>
+      <w:r>
+        <w:rPr>
+          <w:rFonts w:hint="default" w:asciiTheme="minorHAnsi" w:hAnsiTheme="minorHAnsi" w:eastAsiaTheme="minorEastAsia" w:cstheme="minorBidi"/>
+          <w:kern w:val="2"/>
+          <w:sz w:val="21"/>
+          <w:szCs w:val="24"/>
+          <w:highlight w:val="none"/>
+          <w:lang w:val="en-US" w:eastAsia="zh-CN" w:bidi="ar-SA"/>
+        </w:rPr>
+        <w:t>float ReloadCommitDelay;</w:t>
+      </w:r>
+    </w:p>
+    <w:p>
+      <w:pPr>
+        <w:widowControl w:val="0"/>
+        <w:ind w:left="0" w:leftChars="0" w:firstLine="420" w:firstLineChars="200"/>
+        <w:jc w:val="both"/>
+        <w:rPr>
+          <w:rFonts w:hint="default" w:asciiTheme="minorHAnsi" w:hAnsiTheme="minorHAnsi" w:eastAsiaTheme="minorEastAsia" w:cstheme="minorBidi"/>
+          <w:kern w:val="2"/>
+          <w:sz w:val="21"/>
+          <w:szCs w:val="24"/>
+          <w:highlight w:val="none"/>
+          <w:lang w:val="en-US" w:eastAsia="zh-CN" w:bidi="ar-SA"/>
+        </w:rPr>
+      </w:pPr>
+      <w:r>
+        <w:rPr>
+          <w:rFonts w:hint="default" w:asciiTheme="minorHAnsi" w:hAnsiTheme="minorHAnsi" w:eastAsiaTheme="minorEastAsia" w:cstheme="minorBidi"/>
+          <w:kern w:val="2"/>
+          <w:sz w:val="21"/>
+          <w:szCs w:val="24"/>
+          <w:highlight w:val="none"/>
+          <w:lang w:val="en-US" w:eastAsia="zh-CN" w:bidi="ar-SA"/>
+        </w:rPr>
+        <w:t>服务器用 Timer 调用 ReloadAmmo()；AnimNotify 只负责弹匣视觉变化。</w:t>
+      </w:r>
+    </w:p>
+    <w:p>
+      <w:pPr>
+        <w:widowControl w:val="0"/>
+        <w:jc w:val="both"/>
+        <w:rPr>
+          <w:rFonts w:hint="default" w:asciiTheme="minorHAnsi" w:hAnsiTheme="minorHAnsi" w:eastAsiaTheme="minorEastAsia" w:cstheme="minorBidi"/>
+          <w:kern w:val="2"/>
+          <w:sz w:val="21"/>
+          <w:szCs w:val="24"/>
+          <w:highlight w:val="none"/>
+          <w:lang w:val="en-US" w:eastAsia="zh-CN" w:bidi="ar-SA"/>
+        </w:rPr>
+      </w:pPr>
+    </w:p>
+    <w:p>
+      <w:pPr>
+        <w:widowControl w:val="0"/>
+        <w:numPr>
+          <w:numId w:val="0"/>
+        </w:numPr>
+        <w:ind w:leftChars="200"/>
+        <w:jc w:val="both"/>
+        <w:rPr>
+          <w:rFonts w:hint="default"/>
+          <w:highlight w:val="none"/>
+          <w:lang w:val="en-US" w:eastAsia="zh-CN"/>
+        </w:rPr>
+      </w:pPr>
+      <w:r>
+        <w:rPr>
+          <w:rFonts w:hint="default"/>
+          <w:highlight w:val="none"/>
+          <w:lang w:val="en-US" w:eastAsia="zh-CN"/>
+        </w:rPr>
+        <w:t>26.</w:t>
       </w:r>
       <w:bookmarkStart w:id="0" w:name="_GoBack"/>
       <w:bookmarkEnd w:id="0"/>
-      <w:r>
-        <w:rPr>
-          <w:rFonts w:hint="eastAsia"/>
-          <w:highlight w:val="none"/>
-          <w:lang w:val="en-US" w:eastAsia="zh-CN"/>
-        </w:rPr>
-        <w:t>failed</w:t>
-      </w:r>
     </w:p>
     <w:sectPr>
       <w:pgSz w:w="11906" w:h="16838"/>
@@ -882,12 +1195,34 @@
       <w:lang w:val="en-US" w:eastAsia="zh-CN" w:bidi="ar-SA"/>
     </w:rPr>
   </w:style>
-  <w:style w:type="character" w:default="1" w:styleId="3">
+  <w:style w:type="paragraph" w:styleId="2">
+    <w:name w:val="heading 2"/>
+    <w:basedOn w:val="1"/>
+    <w:next w:val="1"/>
+    <w:semiHidden/>
+    <w:unhideWhenUsed/>
+    <w:qFormat/>
+    <w:uiPriority w:val="0"/>
+    <w:pPr>
+      <w:spacing w:before="0" w:beforeAutospacing="1" w:after="0" w:afterAutospacing="1"/>
+      <w:jc w:val="left"/>
+    </w:pPr>
+    <w:rPr>
+      <w:rFonts w:hint="eastAsia" w:ascii="宋体" w:hAnsi="宋体" w:eastAsia="宋体" w:cs="宋体"/>
+      <w:b/>
+      <w:bCs/>
+      <w:kern w:val="0"/>
+      <w:sz w:val="36"/>
+      <w:szCs w:val="36"/>
+      <w:lang w:val="en-US" w:eastAsia="zh-CN" w:bidi="ar"/>
+    </w:rPr>
+  </w:style>
+  <w:style w:type="character" w:default="1" w:styleId="6">
     <w:name w:val="Default Paragraph Font"/>
     <w:semiHidden/>
     <w:uiPriority w:val="0"/>
   </w:style>
-  <w:style w:type="table" w:default="1" w:styleId="2">
+  <w:style w:type="table" w:default="1" w:styleId="5">
     <w:name w:val="Normal Table"/>
     <w:semiHidden/>
     <w:uiPriority w:val="0"/>
@@ -900,31 +1235,88 @@
       </w:tblCellMar>
     </w:tblPr>
   </w:style>
-  <w:style w:type="character" w:customStyle="1" w:styleId="4">
+  <w:style w:type="paragraph" w:styleId="3">
+    <w:name w:val="HTML Preformatted"/>
+    <w:basedOn w:val="1"/>
+    <w:uiPriority w:val="0"/>
+    <w:pPr>
+      <w:tabs>
+        <w:tab w:val="left" w:pos="916"/>
+        <w:tab w:val="left" w:pos="1832"/>
+        <w:tab w:val="left" w:pos="2748"/>
+        <w:tab w:val="left" w:pos="3664"/>
+        <w:tab w:val="left" w:pos="4580"/>
+        <w:tab w:val="left" w:pos="5496"/>
+        <w:tab w:val="left" w:pos="6412"/>
+        <w:tab w:val="left" w:pos="7328"/>
+        <w:tab w:val="left" w:pos="8244"/>
+        <w:tab w:val="left" w:pos="9160"/>
+        <w:tab w:val="left" w:pos="10076"/>
+        <w:tab w:val="left" w:pos="10992"/>
+        <w:tab w:val="left" w:pos="11908"/>
+        <w:tab w:val="left" w:pos="12824"/>
+        <w:tab w:val="left" w:pos="13740"/>
+        <w:tab w:val="left" w:pos="14656"/>
+      </w:tabs>
+      <w:jc w:val="left"/>
+    </w:pPr>
+    <w:rPr>
+      <w:rFonts w:hint="eastAsia" w:ascii="宋体" w:hAnsi="宋体" w:eastAsia="宋体" w:cs="宋体"/>
+      <w:kern w:val="0"/>
+      <w:sz w:val="24"/>
+      <w:szCs w:val="24"/>
+      <w:lang w:val="en-US" w:eastAsia="zh-CN" w:bidi="ar"/>
+    </w:rPr>
+  </w:style>
+  <w:style w:type="paragraph" w:styleId="4">
+    <w:name w:val="Normal (Web)"/>
+    <w:basedOn w:val="1"/>
+    <w:uiPriority w:val="0"/>
+    <w:pPr>
+      <w:spacing w:before="0" w:beforeAutospacing="1" w:after="0" w:afterAutospacing="1"/>
+      <w:ind w:left="0" w:right="0"/>
+      <w:jc w:val="left"/>
+    </w:pPr>
+    <w:rPr>
+      <w:kern w:val="0"/>
+      <w:sz w:val="24"/>
+      <w:lang w:val="en-US" w:eastAsia="zh-CN" w:bidi="ar"/>
+    </w:rPr>
+  </w:style>
+  <w:style w:type="character" w:styleId="7">
+    <w:name w:val="HTML Code"/>
+    <w:basedOn w:val="6"/>
+    <w:uiPriority w:val="0"/>
+    <w:rPr>
+      <w:rFonts w:ascii="Courier New" w:hAnsi="Courier New"/>
+      <w:sz w:val="20"/>
+    </w:rPr>
+  </w:style>
+  <w:style w:type="character" w:customStyle="1" w:styleId="8">
     <w:name w:val="s4"/>
-    <w:basedOn w:val="3"/>
+    <w:basedOn w:val="6"/>
     <w:uiPriority w:val="0"/>
     <w:rPr>
       <w:color w:val="6BC0C2"/>
     </w:rPr>
   </w:style>
-  <w:style w:type="character" w:customStyle="1" w:styleId="5">
+  <w:style w:type="character" w:customStyle="1" w:styleId="9">
     <w:name w:val="s1"/>
-    <w:basedOn w:val="3"/>
+    <w:basedOn w:val="6"/>
     <w:uiPriority w:val="0"/>
     <w:rPr>
       <w:color w:val="E0E0E0"/>
     </w:rPr>
   </w:style>
-  <w:style w:type="character" w:customStyle="1" w:styleId="6">
+  <w:style w:type="character" w:customStyle="1" w:styleId="10">
     <w:name w:val="s3"/>
-    <w:basedOn w:val="3"/>
+    <w:basedOn w:val="6"/>
     <w:uiPriority w:val="0"/>
     <w:rPr>
       <w:color w:val="EDEDED"/>
     </w:rPr>
   </w:style>
-  <w:style w:type="paragraph" w:customStyle="1" w:styleId="7">
+  <w:style w:type="paragraph" w:customStyle="1" w:styleId="11">
     <w:name w:val="p3"/>
     <w:basedOn w:val="1"/>
     <w:uiPriority w:val="0"/>
@@ -943,15 +1335,15 @@
       <w:lang w:val="en-US" w:eastAsia="zh-CN" w:bidi="ar"/>
     </w:rPr>
   </w:style>
-  <w:style w:type="character" w:customStyle="1" w:styleId="8">
+  <w:style w:type="character" w:customStyle="1" w:styleId="12">
     <w:name w:val="s7"/>
-    <w:basedOn w:val="3"/>
+    <w:basedOn w:val="6"/>
     <w:uiPriority w:val="0"/>
     <w:rPr>
       <w:color w:val="8186A3"/>
     </w:rPr>
   </w:style>
-  <w:style w:type="paragraph" w:customStyle="1" w:styleId="9">
+  <w:style w:type="paragraph" w:customStyle="1" w:styleId="13">
     <w:name w:val="p1"/>
     <w:basedOn w:val="1"/>
     <w:uiPriority w:val="0"/>
@@ -970,7 +1362,7 @@
       <w:lang w:val="en-US" w:eastAsia="zh-CN" w:bidi="ar"/>
     </w:rPr>
   </w:style>
-  <w:style w:type="paragraph" w:customStyle="1" w:styleId="10">
+  <w:style w:type="paragraph" w:customStyle="1" w:styleId="14">
     <w:name w:val="p4"/>
     <w:basedOn w:val="1"/>
     <w:uiPriority w:val="0"/>
@@ -989,7 +1381,7 @@
       <w:lang w:val="en-US" w:eastAsia="zh-CN" w:bidi="ar"/>
     </w:rPr>
   </w:style>
-  <w:style w:type="paragraph" w:customStyle="1" w:styleId="11">
+  <w:style w:type="paragraph" w:customStyle="1" w:styleId="15">
     <w:name w:val="p2"/>
     <w:basedOn w:val="1"/>
     <w:uiPriority w:val="0"/>
@@ -1008,30 +1400,30 @@
       <w:lang w:val="en-US" w:eastAsia="zh-CN" w:bidi="ar"/>
     </w:rPr>
   </w:style>
-  <w:style w:type="character" w:customStyle="1" w:styleId="12">
+  <w:style w:type="character" w:customStyle="1" w:styleId="16">
     <w:name w:val="s6"/>
-    <w:basedOn w:val="3"/>
+    <w:basedOn w:val="6"/>
     <w:uiPriority w:val="0"/>
     <w:rPr>
       <w:color w:val="77A2F8"/>
     </w:rPr>
   </w:style>
-  <w:style w:type="character" w:customStyle="1" w:styleId="13">
+  <w:style w:type="character" w:customStyle="1" w:styleId="17">
     <w:name w:val="s2"/>
-    <w:basedOn w:val="3"/>
-    <w:uiPriority w:val="0"/>
-  </w:style>
-  <w:style w:type="character" w:customStyle="1" w:styleId="14">
+    <w:basedOn w:val="6"/>
+    <w:uiPriority w:val="0"/>
+  </w:style>
+  <w:style w:type="character" w:customStyle="1" w:styleId="18">
     <w:name w:val="s8"/>
-    <w:basedOn w:val="3"/>
+    <w:basedOn w:val="6"/>
     <w:uiPriority w:val="0"/>
     <w:rPr>
       <w:color w:val="BE90F5"/>
     </w:rPr>
   </w:style>
-  <w:style w:type="character" w:customStyle="1" w:styleId="15">
+  <w:style w:type="character" w:customStyle="1" w:styleId="19">
     <w:name w:val="s5"/>
-    <w:basedOn w:val="3"/>
+    <w:basedOn w:val="6"/>
     <w:uiPriority w:val="0"/>
     <w:rPr>
       <w:color w:val="85DDCB"/>

</xml_diff>